<commit_message>
Refactor manuscript and add revision report
- Revised the manuscript from abstract to conclusion, enhancing clarity and structure while retaining the CPU-focused research question.
- Improved organization of sections: Abstract, Introduction, Related Work, Methodology, Results, General Discussion, and Conclusion.
- Removed redundant disclaimers and unrelated GPU references; clarified technical aspects of operation intervals and speedup equations.
- Verified and updated session medians for CTR measurements; omitted unverified operation-envelope values.
- Updated literature references and bibliography, ensuring accuracy and relevance.
- Rebuilt both formats with validation checks, confirming structural integrity and visual consistency.
</commit_message>
<xml_diff>
--- a/facta_cpu_aes/main_facta.docx
+++ b/facta_cpu_aes/main_facta.docx
@@ -39,13 +39,13 @@
         <w:t xml:space="preserve">Abstract: </w:t>
       </w:r>
       <w:r>
-        <w:t>Reported encryption throughput is not an intrinsic property of AES: it depends on instruction support, cryptographic-library dispatch, and the interval selected for timing. This paper re-examines existing, validated CPU measurements from a Windows x86-64 laptop and an Oracle Cloud Arm64 instance. In 32 MiB AES-128-CTR measurements, native OpenSSL EVP reaches approximately 4.03 GB/s on Arm64, versus 0.21</w:t>
+        <w:t>Efficient AES encryption is important for secure storage and communication, yet processor support alone does not determine the throughput available to software. This paper examines how library implementation and measurement scope influence CPU encryption performance. We analyze previously collected, validated AES measurements from Windows x86-64 and Oracle Cloud Arm64, with separate CBC and GCM experiments addressing key length and authenticated processing. At 32 MiB, the default OpenSSL CTR implementation reaches 4.03 GB/s on Arm64, compared with 0.21</w:t>
       </w:r>
       <w:r>
         <w:t>–</w:t>
       </w:r>
       <w:r>
-        <w:t>0.22 GB/s for the inspected alternative paths. On x86-64, accounting for allocation and output conversion substantially reduces the apparent gain of native encryption. Historical CBC and authenticated GCM measurements provide an independent perspective on key length, message size, and verification costs. The results support boundary-aware CPU benchmarking but do not establish instruction-level causation or a platform-wide architecture ranking.</w:t>
+        <w:t>0.22 GB/s for the evaluated alternative implementations. On Windows, its throughput advantage over PyCryptodome decreases from approximately 1.9 to 1.2 when timing expands from encryption processing to the instrumented benchmark operation. These findings show why fast cipher execution does not directly predict performance at a broader software interface. They provide a basis for selecting representative benchmarks and identifying where further optimization may benefit encryption services.</w:t>
       </w:r>
     </w:p>
     <w:p>
@@ -80,7 +80,16 @@
         <w:spacing w:line="240" w:lineRule="auto"/>
       </w:pPr>
       <w:r>
-        <w:t>The Advanced Encryption Standard (AES) is used across data storage, software services, embedded devices and communication systems. Its standardized round operations are independent of processor choice, but its measured execution time is not. Modern CPUs may use dedicated cryptographic instructions; software libraries dispatch to different implementations; application frameworks may allocate output storage, initialize contexts and marshal data at different points. A quoted throughput figure can therefore reflect a cryptographic primitive, an application wrapper, or a combination of both.</w:t>
+        <w:t>The Advanced Encryption Standard (AES) is a central component of systems that protect stored and transmitted data</w:t>
+      </w:r>
+      <w:r>
+        <w:t xml:space="preserve"> </w:t>
+      </w:r>
+      <w:r>
+        <w:t>[1]</w:t>
+      </w:r>
+      <w:r>
+        <w:t>. Its computational cost matters in applications ranging from bulk storage encryption to services processing short messages. In these settings, encryption shares processor time and memory bandwidth with other application functions. Understanding its performance therefore requires attention both to the cipher implementation and to the software through which an application invokes it.</w:t>
       </w:r>
     </w:p>
     <w:p>
@@ -89,7 +98,7 @@
         <w:spacing w:line="240" w:lineRule="auto"/>
       </w:pPr>
       <w:r>
-        <w:t>This ambiguity becomes particularly pronounced when implementations cross a foreign-function boundary. A native library can process an already allocated buffer with a preinitialized context, whereas a Python-facing API can include argument handling and allocation. Comparing the resulting durations without stating their scopes risks turning a claim about a specific API into an unsupported claim about an algorithm or processor. Conversely, measuring only the native transform underestimates the elapsed time of a caller that must assemble a complete encryption operation.</w:t>
+        <w:t>Modern processors provide dedicated cryptographic instructions, while libraries select among implementations according to processor capabilities and software configuration. However, applications also initialize cipher contexts, allocate output buffers, convert data representations and transfer control between programming languages. A measurement taken within a native encryption routine excludes some of this work. A measurement around a higher-level call includes more of it. Both are useful, but each describes a different part of the computation.</w:t>
       </w:r>
     </w:p>
     <w:p>
@@ -98,16 +107,34 @@
         <w:spacing w:line="240" w:lineRule="auto"/>
       </w:pPr>
       <w:r>
-        <w:t xml:space="preserve">The present work investigates a narrower question than heterogeneous GPU acceleration: </w:t>
+        <w:t>This distinction matters when evaluating native libraries through Python interfaces. Libraries implementing the same AES mode may perform different preparation and data-handling operations. Their measured difference can consequently reflect cipher implementation, interface design and timer placement. These contributions must be distinguished before using a benchmark to select a library or estimate application capacity.</w:t>
+      </w:r>
+    </w:p>
+    <w:p>
+      <w:pPr>
+        <w:pStyle w:val="JText"/>
+        <w:spacing w:line="240" w:lineRule="auto"/>
+      </w:pPr>
+      <w:r>
+        <w:t xml:space="preserve">This paper addresses the following research question: </w:t>
       </w:r>
       <w:r>
         <w:rPr>
           <w:i/>
         </w:rPr>
-        <w:t>how strongly do AES implementation paths and timing boundaries shape CPU encryption measurements on two instruction-capable architectures?</w:t>
-      </w:r>
-      <w:r>
-        <w:t xml:space="preserve"> We use already completed experimental campaigns: AES-128 ECB/CTR measurements from Windows x86-64 and Oracle Cloud Arm64, historical AES-CBC experiments covering 128-, 192- and 256-bit keys, and independently validated AES-GCM measurements on Windows. No new experiments were performed for this manuscript. In particular, results from different modes or hosts are not combined into a unified speedup estimate.</w:t>
+        <w:t>how do the selected AES implementation and the scope of the timed operation affect measured CPU throughput, and which conclusions remain useful for application design?</w:t>
+      </w:r>
+      <w:r>
+        <w:t xml:space="preserve"> We investigate this question through a retrospective analysis of validated measurements from a Windows x86-64 laptop and an Oracle Cloud Arm64 instance. AES-128 in counter (CTR) mode provides the main workload. Separate Windows experiments with cipher block chaining (CBC) and Galois/Counter Mode (GCM) extend the analysis to key length and authenticated processing</w:t>
+      </w:r>
+      <w:r>
+        <w:t xml:space="preserve"> </w:t>
+      </w:r>
+      <w:r>
+        <w:t>[2, 3]</w:t>
+      </w:r>
+      <w:r>
+        <w:t>.</w:t>
       </w:r>
     </w:p>
     <w:p>
@@ -116,7 +143,7 @@
         <w:spacing w:line="240" w:lineRule="auto"/>
       </w:pPr>
       <w:r>
-        <w:t>The paper has three contributions. First, it documents the magnitude of implementation-path sensitivity on Arm64, including a constrained OpenSSL capability-mask control rather than an unqualified assertion about the AES instruction alone. Second, it distinguishes the native transform from a broader operation envelope on the Windows CPU, using measurements from the same software environment. Third, it analyzes existing AES-CBC and AES-GCM evidence to demonstrate how key length and authentication change throughput within their own explicitly specified workloads. These results motivate a reporting framework in which the cipher mode, implementation, scope, and replication unit accompany each reported performance figure.</w:t>
+        <w:t>The paper makes three contributions. First, it quantifies the differences between the evaluated OpenSSL and PyCryptodome implementations on each host, including an OpenSSL capability-mask experiment on Arm64. Second, it shows how the relative performance observed on Windows changes when timing expands from encryption processing to the complete instrumented benchmark call. Third, it relates these observations to the effects of key length and message size in separate CBC and GCM workloads. Together, these contributions identify the information needed to interpret an encryption throughput figure and assess its relevance to a software service.</w:t>
       </w:r>
     </w:p>
     <w:p>
@@ -125,7 +152,52 @@
         <w:spacing w:line="240" w:lineRule="auto"/>
       </w:pPr>
       <w:r>
-        <w:t>This is a retrospective analysis of available datasets, not an attempt to introduce a new cipher or claim a universal processor ranking. All numerical claims are tied to existing experiment outputs; where datasets are not identically instrumented, the limitation is stated explicitly.</w:t>
+        <w:t>The analysis uses existing experimental records; no additional measurements were collected for this paper. Comparisons are made within each host and workload, with the timing differences stated explicitly. Section</w:t>
+      </w:r>
+      <w:r>
+        <w:t xml:space="preserve"> </w:t>
+      </w:r>
+      <w:r>
+        <w:t>2</w:t>
+      </w:r>
+      <w:r>
+        <w:t xml:space="preserve"> places the study in the context of AES implementation and benchmarking research. Section</w:t>
+      </w:r>
+      <w:r>
+        <w:t xml:space="preserve"> </w:t>
+      </w:r>
+      <w:r>
+        <w:t>3</w:t>
+      </w:r>
+      <w:r>
+        <w:t xml:space="preserve"> describes the experimental setup and estimators. Section</w:t>
+      </w:r>
+      <w:r>
+        <w:t xml:space="preserve"> </w:t>
+      </w:r>
+      <w:r>
+        <w:t>4</w:t>
+      </w:r>
+      <w:r>
+        <w:t xml:space="preserve"> presents the results and their interpretation, followed by broader implications, limitations and future work in Section</w:t>
+      </w:r>
+      <w:r>
+        <w:t xml:space="preserve"> </w:t>
+      </w:r>
+      <w:r>
+        <w:t>5</w:t>
+      </w:r>
+      <w:r>
+        <w:t>. Section</w:t>
+      </w:r>
+      <w:r>
+        <w:t xml:space="preserve"> </w:t>
+      </w:r>
+      <w:r>
+        <w:t>6</w:t>
+      </w:r>
+      <w:r>
+        <w:t xml:space="preserve"> concludes the paper.</w:t>
       </w:r>
     </w:p>
     <w:p>
@@ -137,7 +209,7 @@
         <w:tab/>
       </w:r>
       <w:r>
-        <w:t>Background and Related Work</w:t>
+        <w:t>Related Work and Research Gap</w:t>
       </w:r>
     </w:p>
     <w:p>
@@ -149,7 +221,7 @@
         <w:tab/>
       </w:r>
       <w:r>
-        <w:t>AES implementation paths and instruction support</w:t>
+        <w:t>AES implementations and workload characteristics</w:t>
       </w:r>
     </w:p>
     <w:p>
@@ -158,7 +230,7 @@
         <w:spacing w:line="240" w:lineRule="auto"/>
       </w:pPr>
       <w:r>
-        <w:t>AES is specified by FIPS 197 and is instantiated with 128-, 192- or 256-bit keys, requiring 10, 12 or 14 encryption rounds, respectively</w:t>
+        <w:t>AES uses a fixed block size and supports 128-, 192- and 256-bit keys, with 10, 12 and 14 rounds, respectively</w:t>
       </w:r>
       <w:r>
         <w:t xml:space="preserve"> </w:t>
@@ -167,7 +239,7 @@
         <w:t>[1]</w:t>
       </w:r>
       <w:r>
-        <w:t>. Modes of operation govern how successive blocks and counters are processed, not merely which key length is used. CBC encryption has inter-block dependencies, whereas CTR encrypts successive counter blocks and combines the resulting stream with the plaintext</w:t>
+        <w:t>. The mode of operation determines how these block transformations are combined. CBC encryption introduces dependencies between successive blocks, whereas CTR generates keystream from independent counter values</w:t>
       </w:r>
       <w:r>
         <w:t xml:space="preserve"> </w:t>
@@ -176,7 +248,16 @@
         <w:t>[2]</w:t>
       </w:r>
       <w:r>
-        <w:t>. ECB is useful here only as an implementation-path diagnostic, not as a recommendation for sensitive data.</w:t>
+        <w:t>. GCM combines counter-mode encryption with authentication and includes tag generation or verification</w:t>
+      </w:r>
+      <w:r>
+        <w:t xml:space="preserve"> </w:t>
+      </w:r>
+      <w:r>
+        <w:t>[3]</w:t>
+      </w:r>
+      <w:r>
+        <w:t>. These differences affect the available parallelism and the work performed per message, so performance must be interpreted for a specified mode and operation.</w:t>
       </w:r>
     </w:p>
     <w:p>
@@ -185,7 +266,13 @@
         <w:spacing w:line="240" w:lineRule="auto"/>
       </w:pPr>
       <w:r>
-        <w:t>Intel's AES-NI instructions provide an acceleration path for AES rounds</w:t>
+        <w:t>Research on efficient AES implementations has examined both instruction support and software organization. K</w:t>
+      </w:r>
+      <w:r>
+        <w:t>ä</w:t>
+      </w:r>
+      <w:r>
+        <w:t>sper and Schwabe</w:t>
       </w:r>
       <w:r>
         <w:t xml:space="preserve"> </w:t>
@@ -194,7 +281,7 @@
         <w:t>[4]</w:t>
       </w:r>
       <w:r>
-        <w:t>. Armv8 implementations can expose hardware AES features through the instruction-set architecture, but availability and actual library dispatch must be established on the measured system. OpenSSL's EVP interface offers a relatively stable cipher abstraction whose internal implementation may differ with providers, CPU features and OpenSSL version</w:t>
+        <w:t xml:space="preserve"> presented a bitsliced implementation for 64-bit Intel processors and investigated AES-GCM performance together with resistance to timing attacks. Their work demonstrates that implementation choices matter for both efficiency and security. Intel's AES-NI instructions provide dedicated operations for AES processing</w:t>
       </w:r>
       <w:r>
         <w:t xml:space="preserve"> </w:t>
@@ -203,7 +290,16 @@
         <w:t>[5]</w:t>
       </w:r>
       <w:r>
-        <w:t>. The PyCryptodome package similarly exposes AES operations through a Python API and native code, with behavior that cannot be assumed identical to EVP</w:t>
+        <w:t>. Such mechanisms explain why the same standardized cipher can have substantially different execution costs across implementations, even before application overhead is considered.</w:t>
+      </w:r>
+    </w:p>
+    <w:p>
+      <w:pPr>
+        <w:pStyle w:val="JText"/>
+        <w:spacing w:line="240" w:lineRule="auto"/>
+      </w:pPr>
+      <w:r>
+        <w:t>Library interfaces add another layer. OpenSSL EVP exposes cipher operations through an abstraction whose selected implementation depends on the library configuration and available processor features</w:t>
       </w:r>
       <w:r>
         <w:t xml:space="preserve"> </w:t>
@@ -212,181 +308,199 @@
         <w:t>[6]</w:t>
       </w:r>
       <w:r>
-        <w:t xml:space="preserve">. Thus an observed difference is initially an </w:t>
+        <w:t>. PyCryptodome provides AES modes through a Python interface backed by native code</w:t>
+      </w:r>
+      <w:r>
+        <w:t xml:space="preserve"> </w:t>
+      </w:r>
+      <w:r>
+        <w:t>[7]</w:t>
+      </w:r>
+      <w:r>
+        <w:t>. Neither the common algorithm name nor the availability of processor instructions guarantees that two interfaces select equivalent code or include the same work in a timed call. The present comparison therefore concerns the particular library configurations and interfaces recorded in the experiments.</w:t>
+      </w:r>
+    </w:p>
+    <w:p>
+      <w:pPr>
+        <w:pStyle w:val="JSubSubTitle"/>
+      </w:pPr>
+      <w:r>
+        <w:t>2.2</w:t>
+        <w:tab/>
+      </w:r>
+      <w:r>
+        <w:t>Benchmark interpretation and the scope of this study</w:t>
+      </w:r>
+    </w:p>
+    <w:p>
+      <w:pPr>
+        <w:pStyle w:val="JText"/>
+        <w:spacing w:line="240" w:lineRule="auto"/>
+      </w:pPr>
+      <w:r>
+        <w:t>Systems research has established that apparently minor experimental choices can affect measured performance. Mytkowicz et al.</w:t>
+      </w:r>
+      <w:r>
+        <w:t xml:space="preserve"> </w:t>
+      </w:r>
+      <w:r>
+        <w:t>[8]</w:t>
+      </w:r>
+      <w:r>
+        <w:t xml:space="preserve"> demonstrated measurement bias arising from experimental setup. Kalibera and Jones</w:t>
+      </w:r>
+      <w:r>
+        <w:t xml:space="preserve"> </w:t>
+      </w:r>
+      <w:r>
+        <w:t>[9]</w:t>
+      </w:r>
+      <w:r>
+        <w:t xml:space="preserve"> developed a methodology that accounts for variation at different levels of repetition. These studies motivate documenting the execution environment and distinguishing repeated timings within a session from replication across sessions or machines.</w:t>
+      </w:r>
+    </w:p>
+    <w:p>
+      <w:pPr>
+        <w:pStyle w:val="JText"/>
+        <w:spacing w:line="240" w:lineRule="auto"/>
+      </w:pPr>
+      <w:r>
+        <w:t>For encryption benchmarks, measurement scope introduces a further interpretive issue. Timing the cipher transformation answers a question about processing prepared data. Timing a surrounding software operation also captures some combination of preparation, allocation, interface overhead and result handling. In authenticated encryption, tag processing and associated data introduce additional work. A throughput comparison is therefore meaningful only when these inclusions are identified alongside the payload size and implementation.</w:t>
+      </w:r>
+    </w:p>
+    <w:p>
+      <w:pPr>
+        <w:pStyle w:val="JText"/>
+        <w:spacing w:line="240" w:lineRule="auto"/>
+      </w:pPr>
+      <w:r>
+        <w:t>The practical question addressed here is how strongly implementation and timing choices alter the interpretation of CPU encryption benchmarks. This study connects AES implementation research with benchmarking methodology through documented comparisons of library paths, timing scopes and cryptographic workloads. Its contribution is empirical clarification of these relationships on two systems, rather than a new AES implementation.</w:t>
+      </w:r>
+    </w:p>
+    <w:p>
+      <w:pPr>
+        <w:pStyle w:val="JSubtitle"/>
+      </w:pPr>
+      <w:r>
+        <w:t>3</w:t>
+        <w:tab/>
+      </w:r>
+      <w:r>
+        <w:t>Methodology and Experimental Setup</w:t>
+      </w:r>
+    </w:p>
+    <w:p>
+      <w:pPr>
+        <w:pStyle w:val="JSubSubTitle"/>
+      </w:pPr>
+      <w:r>
+        <w:t>3.1</w:t>
+        <w:tab/>
+      </w:r>
+      <w:r>
+        <w:t>Platforms, datasets and correctness checks</w:t>
+      </w:r>
+    </w:p>
+    <w:p>
+      <w:pPr>
+        <w:pStyle w:val="JText"/>
+        <w:spacing w:line="240" w:lineRule="auto"/>
+      </w:pPr>
+      <w:r>
+        <w:t>The primary dataset contains CPU library measurements from two environments. The Windows system used an Intel Core i5-10300H with four physical cores and eight logical processors, Python 3.12.10, PyCryptodome 3.23.0 and verified 64-bit OpenSSL 3.6.5 libraries. The Oracle Cloud system used a Neoverse-N1-class Arm64 processor with two available virtual CPUs, Python 3.12.3 and OpenSSL 3.0.13. The original records preserve platform metadata, processor capabilities and source hashes. The hosts differ in operating system, library version and hardware configuration, so each is analyzed separately.</w:t>
+      </w:r>
+    </w:p>
+    <w:p>
+      <w:pPr>
+        <w:pStyle w:val="JText"/>
+        <w:spacing w:line="240" w:lineRule="auto"/>
+      </w:pPr>
+      <w:r>
+        <w:t>The primary campaigns evaluated AES-128 at payload sizes of 1 KiB, 16 KiB, 1 MiB, 16 MiB and 32 MiB. CTR is the principal workload presented here. Electronic codebook (ECB) measurements in the source records served as implementation diagnostics. Each configuration was measured in five sessions with seeds 2003</w:t>
+      </w:r>
+      <w:r>
+        <w:t>–</w:t>
+      </w:r>
+      <w:r>
+        <w:t>2007, using five warm-up repetitions and 20 measured repetitions per session. Known-answer and differential checks established ciphertext correctness before performance results were accepted. Raw observations, metadata and session summaries were retained.</w:t>
+      </w:r>
+    </w:p>
+    <w:p>
+      <w:pPr>
+        <w:pStyle w:val="JText"/>
+        <w:spacing w:line="240" w:lineRule="auto"/>
+      </w:pPr>
+      <w:r>
+        <w:t>Two earlier Windows campaigns provide complementary evidence. The CBC experiment compared software and AES-NI-enabled implementations for 128-, 192- and 256-bit keys; the present paper reports its 10 MiB encryption results. The GCM experiment evaluated 128- and 256-bit keys at 1 KiB, 16 KiB, 1 MiB, 16 MiB and 100 MiB. Both used five seeded sessions, three warm-up repetitions and 20 measured repetitions. These datasets retain their original timing definitions and are analyzed separately from the CTR campaign.</w:t>
+      </w:r>
+    </w:p>
+    <w:p>
+      <w:pPr>
+        <w:pStyle w:val="JText"/>
+        <w:spacing w:line="240" w:lineRule="auto"/>
+      </w:pPr>
+      <w:r>
+        <w:t>The GCM workload used a 96-bit nonce, a 128-bit authentication tag and 16 bytes of associated authenticated data (AAD), with no nonce reuse for distinct messages under the same key within a session. Validation included known-answer checks and rejection of modified ciphertext, tags and AAD. These checks establish functional correctness for the tested cases; they do not constitute a side-channel security evaluation.</w:t>
+      </w:r>
+    </w:p>
+    <w:p>
+      <w:pPr>
+        <w:pStyle w:val="JSubSubTitle"/>
+      </w:pPr>
+      <w:r>
+        <w:t>3.2</w:t>
+        <w:tab/>
+      </w:r>
+      <w:r>
+        <w:t>Implementation paths and timing scopes</w:t>
+      </w:r>
+    </w:p>
+    <w:p>
+      <w:pPr>
+        <w:pStyle w:val="JText"/>
+        <w:spacing w:line="240" w:lineRule="auto"/>
+      </w:pPr>
+      <w:r>
+        <w:t>The CTR comparison uses PyCryptodome and native OpenSSL EVP. Both transform measurements use prepared output buffers. For OpenSSL, timestamps inside the compiled wrapper delimit the EVP Update/Final processing. For PyCryptodome, the transform interval includes Python dispatch and the library's internal foreign-function interface. Thus, the recorded transform rates describe each implementation at its measured interface; their ratio does not isolate the relative cost of AES instructions.</w:t>
+      </w:r>
+    </w:p>
+    <w:p>
+      <w:pPr>
+        <w:pStyle w:val="JText"/>
+        <w:spacing w:line="240" w:lineRule="auto"/>
+      </w:pPr>
+      <w:r>
+        <w:t xml:space="preserve">A second interval, termed the </w:t>
       </w:r>
       <w:r>
         <w:rPr>
           <w:i/>
         </w:rPr>
-        <w:t>implementation-path difference</w:t>
-      </w:r>
-      <w:r>
-        <w:t>, not proof that a particular instruction is solely responsible.</w:t>
-      </w:r>
-    </w:p>
-    <w:p>
-      <w:pPr>
-        <w:pStyle w:val="JSubSubTitle"/>
-      </w:pPr>
-      <w:r>
-        <w:t>2.2</w:t>
-        <w:tab/>
-      </w:r>
-      <w:r>
-        <w:t>Measurement scope and authenticated encryption</w:t>
-      </w:r>
-    </w:p>
-    <w:p>
-      <w:pPr>
-        <w:pStyle w:val="JText"/>
-        <w:spacing w:line="240" w:lineRule="auto"/>
-      </w:pPr>
-      <w:r>
-        <w:t>Meaningful comparisons require matched payloads, validated ciphertexts and explicit placement of timestamps. A transform-only duration can exclude cipher setup and allocation, while an operation-envelope duration includes a more complete software call. Both may be useful, but they answer different questions and should not be placed into a single speedup column without qualification. Native measurements may also exclude Python entry overhead that another backend includes.</w:t>
-      </w:r>
-    </w:p>
-    <w:p>
-      <w:pPr>
-        <w:pStyle w:val="JText"/>
-        <w:spacing w:line="240" w:lineRule="auto"/>
-      </w:pPr>
-      <w:r>
-        <w:t>Authenticated encryption introduces a separate distinction. Galois/Counter Mode combines CTR-style encryption with an authentication computation and can verify a tag during decryption</w:t>
-      </w:r>
-      <w:r>
-        <w:t xml:space="preserve"> </w:t>
-      </w:r>
-      <w:r>
-        <w:t>[3]</w:t>
-      </w:r>
-      <w:r>
-        <w:t>. A GCM processing rate therefore measures more functionality than unauthenticated CBC or CTR. The authentication tag, associated data, and encryption context may be outside the byte-count numerator even when their processing is within the timer. Treating these rates as interchangeable AES-throughput figures would be misleading.</w:t>
-      </w:r>
-    </w:p>
-    <w:p>
-      <w:pPr>
-        <w:pStyle w:val="JText"/>
-        <w:spacing w:line="240" w:lineRule="auto"/>
-      </w:pPr>
-      <w:r>
-        <w:t xml:space="preserve">The gap addressed here is primarily </w:t>
-      </w:r>
-      <w:r>
-        <w:rPr>
-          <w:i/>
-        </w:rPr>
-        <w:t>reporting and interpretation</w:t>
-      </w:r>
-      <w:r>
-        <w:t>: the same CPU, algorithm family and message size can yield dramatically different advertised throughput because of implementation and instrumentation decisions. Rather than proposing a new accelerated implementation, this article organizes existing validated observations around the exact execution boundaries that produced them.</w:t>
-      </w:r>
-    </w:p>
-    <w:p>
-      <w:pPr>
-        <w:pStyle w:val="JSubtitle"/>
-      </w:pPr>
-      <w:r>
-        <w:t>3</w:t>
-        <w:tab/>
-      </w:r>
-      <w:r>
-        <w:t>Experimental Material and Method</w:t>
-      </w:r>
-    </w:p>
-    <w:p>
-      <w:pPr>
-        <w:pStyle w:val="JSubSubTitle"/>
-      </w:pPr>
-      <w:r>
-        <w:t>3.1</w:t>
-        <w:tab/>
-      </w:r>
-      <w:r>
-        <w:t>Platforms and provenance</w:t>
-      </w:r>
-    </w:p>
-    <w:p>
-      <w:pPr>
-        <w:pStyle w:val="JText"/>
-        <w:spacing w:line="240" w:lineRule="auto"/>
-      </w:pPr>
-      <w:r>
-        <w:t xml:space="preserve">The retained CPU evidence comes from two distinct environments. The Windows host used an Intel Core i5-10300H (four physical cores, eight logical processors), Python 3.12.10, PyCryptodome 3.23.0 and verified 64-bit OpenSSL 3.6.5 libraries. The Linux Arm64 host was an Oracle Cloud instance on a Neoverse-N1-class CPU, with two available virtual CPUs, Python 3.12.3 and OpenSSL 3.0.13. Architecture, software version, CPU capability and source hashes were preserved in the original experiment records. The two hosts were not matched for frequency, memory hierarchy, virtualization or operating system; hence no intrinsic </w:t>
-      </w:r>
-      <w:r>
-        <w:t>“</w:t>
-      </w:r>
-      <w:r>
-        <w:t>Intel versus Arm</w:t>
-      </w:r>
-      <w:r>
-        <w:t>”</w:t>
-      </w:r>
-      <w:r>
-        <w:t xml:space="preserve"> hardware speedup is reported.</w:t>
-      </w:r>
-    </w:p>
-    <w:p>
-      <w:pPr>
-        <w:pStyle w:val="JText"/>
-        <w:spacing w:line="240" w:lineRule="auto"/>
-      </w:pPr>
-      <w:r>
-        <w:t>The campaigns comprised five seeded sessions (2003</w:t>
-      </w:r>
-      <w:r>
-        <w:t>–</w:t>
-      </w:r>
-      <w:r>
-        <w:t>2007), known-answer and differential correctness checks, and separate raw, metadata and summary records. In the CPU library-path campaigns, each size/mode/backend configuration used 20 measured repetitions following five warm-up repetitions. We aggregate session medians rather than pooling all repetitions as if they were independent machines. Historical CBC and GCM figures arose from earlier validated local campaigns; their definitions are retained and are not silently harmonized with the later OpenSSL measurements.</w:t>
-      </w:r>
-    </w:p>
-    <w:p>
-      <w:pPr>
-        <w:pStyle w:val="JText"/>
-        <w:spacing w:line="240" w:lineRule="auto"/>
-      </w:pPr>
-      <w:r>
-        <w:t>A second Windows workstation (Intel Core i7-11850H, NVIDIA T600) participated in an earlier heterogeneous study. Since the available evidence does not establish an equivalent new OpenSSL CPU-only campaign on that workstation, it is deliberately excluded from the quantitative comparisons of this article. In the same spirit, historical CUDA and page-batching results belong to a distinct submitted manuscript and are not used here.</w:t>
-      </w:r>
-    </w:p>
-    <w:p>
-      <w:pPr>
-        <w:pStyle w:val="JSubSubTitle"/>
-      </w:pPr>
-      <w:r>
-        <w:t>3.2</w:t>
-        <w:tab/>
-      </w:r>
-      <w:r>
-        <w:t>Compared operations and execution boundaries</w:t>
-      </w:r>
-    </w:p>
-    <w:p>
-      <w:pPr>
-        <w:pStyle w:val="JText"/>
-        <w:spacing w:line="240" w:lineRule="auto"/>
-      </w:pPr>
-      <w:r>
-        <w:t xml:space="preserve">The new CPU-only campaigns implement AES-128 in CTR and ECB modes using PyCryptodome and native OpenSSL EVP. CTR is analyzed as the confidentiality workload; ECB is retained solely as a same-platform implementation diagnostic. The OpenSSL native boundary measures the core EVP Update/Final transform. A separate operation-envelope boundary includes Python-side allocation, setup, bindings, native invocation, conversion to a </w:t>
+        <w:t>instrumented operation</w:t>
+      </w:r>
+      <w:r>
+        <w:t xml:space="preserve">, measures the Python call to the benchmark's measurement routine. It includes input checks, allocation, buffer bindings, setup, transformation, cleanup and output conversion, together with diagnostic calls and timing bookkeeping where applicable. This is the interval named </w:t>
       </w:r>
       <w:r>
         <w:rPr>
           <w:rFonts w:ascii="Courier New" w:hAnsi="Courier New"/>
         </w:rPr>
-        <w:t>bytes</w:t>
-      </w:r>
-      <w:r>
-        <w:t xml:space="preserve"> result and relevant cleanup, subject to the explicit wrapper instrumentation. The Python and native transform intervals are not perfectly symmetric: Python invocation/FFI is included in the PyCryptodome path but the outer </w:t>
+        <w:t>operation</w:t>
       </w:r>
       <w:r>
         <w:rPr>
           <w:rFonts w:ascii="Courier New" w:hAnsi="Courier New"/>
         </w:rPr>
-        <w:t>ctypes</w:t>
-      </w:r>
-      <w:r>
-        <w:t xml:space="preserve"> entry is excluded from the native EVP interval.</w:t>
+        <w:t>_</w:t>
+      </w:r>
+      <w:r>
+        <w:rPr>
+          <w:rFonts w:ascii="Courier New" w:hAnsi="Courier New"/>
+        </w:rPr>
+        <w:t>envelope</w:t>
+      </w:r>
+      <w:r>
+        <w:t xml:space="preserve"> in the records. It provides a broader view of the same benchmark execution, but is not an uninstrumented application request or a complete storage or network operation. The Windows dataset provides both intervals for the library comparison.</w:t>
       </w:r>
     </w:p>
     <w:p>
@@ -395,7 +509,7 @@
         <w:spacing w:line="240" w:lineRule="auto"/>
       </w:pPr>
       <w:r>
-        <w:t xml:space="preserve">On Arm64 an additional </w:t>
+        <w:t xml:space="preserve">On Arm64, OpenSSL was also evaluated with </w:t>
       </w:r>
       <w:r>
         <w:rPr>
@@ -416,16 +530,7 @@
         <w:t>armcap=0</w:t>
       </w:r>
       <w:r>
-        <w:t xml:space="preserve"> condition restricts several optimized instruction paths. It is a broad feature-mask control, </w:t>
-      </w:r>
-      <w:r>
-        <w:rPr>
-          <w:i/>
-        </w:rPr>
-        <w:t>not</w:t>
-      </w:r>
-      <w:r>
-        <w:t xml:space="preserve"> a selective experiment disabling only AES rounds. The test verifies ciphertext correctness, but the study does not trace executed instructions or isolate NEON, AES and polynomial-multiply effects individually. We therefore describe these measurements as default-versus-masked OpenSSL paths.</w:t>
+        <w:t>. This setting disables multiple optimized capability paths. Comparing it with the default configuration tests sensitivity to capability selection within OpenSSL, but cannot isolate the effect of the AES extension from other disabled features. The analysis uses the archived Arm64 transform summaries and does not infer unrecorded instruction execution from capability flags.</w:t>
       </w:r>
     </w:p>
     <w:p>
@@ -434,7 +539,7 @@
         <w:spacing w:line="240" w:lineRule="auto"/>
       </w:pPr>
       <w:r>
-        <w:t>The historical CBC measurements compare software AES and an AES-NI-enabled library path for key lengths 128, 192 and 256 bits. Historical GCM measurements use AES-128 and AES-256, 96-bit nonces, a 128-bit tag and a 16-byte associated-data field. Known-answer tests and rejection of modified ciphertext, authentication tag and associated data were required before accepting samples. GCM encryption includes encryption and tag generation, while decryption includes tag verification, and excludes construction of a fresh GCM cipher object from its processing timer.</w:t>
+        <w:t>The CBC results compare the software and AES-NI paths under the original campaign's common timing convention. GCM encryption includes AAD processing, payload encryption, output allocation and tag generation; decryption includes authentication-tag verification. Construction of a fresh GCM cipher object is excluded. Throughput counts payload bytes only, even though AAD and tag processing contribute to elapsed time. These rates therefore describe authenticated payload processing after object construction, rather than complete message latency.</w:t>
       </w:r>
     </w:p>
     <w:p>
@@ -446,7 +551,7 @@
         <w:tab/>
       </w:r>
       <w:r>
-        <w:t>Estimators and statistical interpretation</w:t>
+        <w:t>Aggregation and interpretation</w:t>
       </w:r>
     </w:p>
     <w:p>
@@ -473,7 +578,7 @@
         </m:box>
       </m:oMath>
       <w:r>
-        <w:t xml:space="preserve"> bytes and measured elapsed time </w:t>
+        <w:t xml:space="preserve"> bytes processed in </w:t>
       </w:r>
       <m:oMath>
         <m:box>
@@ -666,7 +771,16 @@
         <w:spacing w:line="240" w:lineRule="auto"/>
       </w:pPr>
       <w:r>
-        <w:t xml:space="preserve">For implementations </w:t>
+        <w:t>KiB and MiB denote binary payload sizes; MB/s and GB/s denote decimal rates. Each primary result is the median of five session-level throughput medians. Session ranges, where reported, describe the smallest and largest of those five medians rather than confidence intervals.</w:t>
+      </w:r>
+    </w:p>
+    <w:p>
+      <w:pPr>
+        <w:pStyle w:val="JText"/>
+        <w:spacing w:line="240" w:lineRule="auto"/>
+      </w:pPr>
+      <w:r>
+        <w:t xml:space="preserve">For a reference implementation </w:t>
       </w:r>
       <m:oMath>
         <m:box>
@@ -684,7 +798,7 @@
         </m:box>
       </m:oMath>
       <w:r>
-        <w:t xml:space="preserve"> and </w:t>
+        <w:t xml:space="preserve"> and a candidate </w:t>
       </w:r>
       <m:oMath>
         <m:box>
@@ -702,7 +816,43 @@
         </m:box>
       </m:oMath>
       <w:r>
-        <w:t xml:space="preserve"> measured on the same host and at compatible timing boundaries, the session speedup is the ratio of their median elapsed times:</w:t>
+        <w:t xml:space="preserve"> measured under a common timing convention, the speedup of </w:t>
+      </w:r>
+      <m:oMath>
+        <m:box>
+          <m:e>
+            <m:r>
+              <m:rPr>
+                <m:sty m:val="i"/>
+              </m:rPr>
+              <w:rPr>
+                <w:sz w:val="22"/>
+              </w:rPr>
+              <m:t>B</m:t>
+            </m:r>
+          </m:e>
+        </m:box>
+      </m:oMath>
+      <w:r>
+        <w:t xml:space="preserve"> relative to </w:t>
+      </w:r>
+      <m:oMath>
+        <m:box>
+          <m:e>
+            <m:r>
+              <m:rPr>
+                <m:sty m:val="i"/>
+              </m:rPr>
+              <w:rPr>
+                <w:sz w:val="22"/>
+              </w:rPr>
+              <m:t>A</m:t>
+            </m:r>
+          </m:e>
+        </m:box>
+      </m:oMath>
+      <w:r>
+        <w:t xml:space="preserve"> is</w:t>
       </w:r>
     </w:p>
     <w:p>
@@ -738,7 +888,7 @@
                       <w:rPr>
                         <w:sz w:val="22"/>
                       </w:rPr>
-                      <m:t>A</m:t>
+                      <m:t>B</m:t>
                     </m:r>
                     <m:r>
                       <m:rPr>
@@ -756,7 +906,7 @@
                       <w:rPr>
                         <w:sz w:val="22"/>
                       </w:rPr>
-                      <m:t>B</m:t>
+                      <m:t>A</m:t>
                     </m:r>
                   </m:e>
                 </m:box>
@@ -983,7 +1133,7 @@
                       <w:rPr>
                         <w:sz w:val="22"/>
                       </w:rPr>
-                      <m:t>A</m:t>
+                      <m:t>B</m:t>
                     </m:r>
                     <m:r>
                       <m:rPr>
@@ -1001,7 +1151,7 @@
                       <w:rPr>
                         <w:sz w:val="22"/>
                       </w:rPr>
-                      <m:t>B</m:t>
+                      <m:t>A</m:t>
                     </m:r>
                   </m:e>
                 </m:box>
@@ -1100,7 +1250,7 @@
                       <w:rPr>
                         <w:sz w:val="22"/>
                       </w:rPr>
-                      <m:t>A</m:t>
+                      <m:t>B</m:t>
                     </m:r>
                     <m:r>
                       <m:rPr>
@@ -1118,7 +1268,7 @@
                       <w:rPr>
                         <w:sz w:val="22"/>
                       </w:rPr>
-                      <m:t>B</m:t>
+                      <m:t>A</m:t>
                     </m:r>
                   </m:e>
                 </m:box>
@@ -1180,7 +1330,77 @@
         <w:spacing w:line="240" w:lineRule="auto"/>
       </w:pPr>
       <w:r>
-        <w:t>Numerical tables in this paper use session-median throughput summaries unless explicitly labeled as a paired time ratio. A median of time ratios need not equal a ratio of separately rounded throughput medians. Five sessions provide descriptive repeatability, not population-level confidence intervals or causality. No outlier exclusion is justified by performance direction. Underlying studies use different scopes; comparisons across them are labeled contextual rather than paired.</w:t>
+        <w:t xml:space="preserve">Here, </w:t>
+      </w:r>
+      <m:oMath>
+        <m:box>
+          <m:e>
+            <m:acc>
+              <m:accPr>
+                <m:chr m:val="̃"/>
+              </m:accPr>
+              <m:e>
+                <m:r>
+                  <m:rPr>
+                    <m:sty m:val="i"/>
+                  </m:rPr>
+                  <w:rPr>
+                    <w:sz w:val="22"/>
+                  </w:rPr>
+                  <m:t>t</m:t>
+                </m:r>
+              </m:e>
+            </m:acc>
+          </m:e>
+        </m:box>
+      </m:oMath>
+      <w:r>
+        <w:t xml:space="preserve"> denotes the median elapsed time in session </w:t>
+      </w:r>
+      <m:oMath>
+        <m:box>
+          <m:e>
+            <m:r>
+              <m:rPr>
+                <m:sty m:val="i"/>
+              </m:rPr>
+              <w:rPr>
+                <w:sz w:val="22"/>
+              </w:rPr>
+              <m:t>j</m:t>
+            </m:r>
+          </m:e>
+        </m:box>
+      </m:oMath>
+      <w:r>
+        <w:t xml:space="preserve">; a value above one indicates faster execution by </w:t>
+      </w:r>
+      <m:oMath>
+        <m:box>
+          <m:e>
+            <m:r>
+              <m:rPr>
+                <m:sty m:val="i"/>
+              </m:rPr>
+              <w:rPr>
+                <w:sz w:val="22"/>
+              </w:rPr>
+              <m:t>B</m:t>
+            </m:r>
+          </m:e>
+        </m:box>
+      </m:oMath>
+      <w:r>
+        <w:t>. The CBC acceleration factors use this estimator. Approximate CTR throughput ratios discussed below are ratios of the reported aggregate rates, and are distinguished from session-based speedups. Rounding and the order of aggregation can make these estimators differ.</w:t>
+      </w:r>
+    </w:p>
+    <w:p>
+      <w:pPr>
+        <w:pStyle w:val="JText"/>
+        <w:spacing w:line="240" w:lineRule="auto"/>
+      </w:pPr>
+      <w:r>
+        <w:t>The session is the unit of replication. Repetitions are not pooled to imply additional independent experiments, and observations are not excluded because they show unfavorable performance. Five sessions characterize repeatability on the measured host, but do not establish population-level behavior across processors. Comparisons across hosts or cipher modes are descriptive and are not treated as paired trials.</w:t>
       </w:r>
     </w:p>
     <w:p>
@@ -1192,7 +1412,7 @@
         <w:tab/>
       </w:r>
       <w:r>
-        <w:t>Results</w:t>
+        <w:t>Experimental Results and Interpretation</w:t>
       </w:r>
     </w:p>
     <w:p>
@@ -1204,7 +1424,7 @@
         <w:tab/>
       </w:r>
       <w:r>
-        <w:t>Library-path sensitivity on two CPUs</w:t>
+        <w:t>Effect of the library implementation</w:t>
       </w:r>
     </w:p>
     <w:p>
@@ -1231,13 +1451,7 @@
         <w:t>1</w:t>
       </w:r>
       <w:r>
-        <w:t xml:space="preserve"> condenses the new CPU-only results at 32 MiB in CTR mode. Values are median throughputs of the five session-level medians. On Arm64, the default EVP path achieves approximately 4.03 GB/s at its native transformation boundary; the inspected PyCryptodome and masked-capability paths achieve about 0.21</w:t>
-      </w:r>
-      <w:r>
-        <w:t>–</w:t>
-      </w:r>
-      <w:r>
-        <w:t>0.22 GB/s. This more-than-one-order-of-magnitude separation is specific to the measured software paths. It does not show that Arm64 universally outperforms x86-64, and should not be presented as a pure hardware-instruction factor.</w:t>
+        <w:t xml:space="preserve"> summarizes AES-128-CTR throughput at 32 MiB. On Windows, the OpenSSL transform rate is 5537 MB/s, compared with 2877 MB/s for PyCryptodome. On Arm64, default OpenSSL reaches 4030 MB/s, whereas the masked OpenSSL configuration and PyCryptodome achieve 218 and 209 MB/s, respectively. These values are medians across five sessions for each configuration.</w:t>
       </w:r>
     </w:p>
     <w:p>
@@ -1258,7 +1472,7 @@
         <w:rPr>
           <w:i/>
         </w:rPr>
-        <w:t>AES-128-CTR, 32 MiB: reported throughput by CPU platform, implementation and timing boundary (decimal MB/s).</w:t>
+        <w:t>AES-128-CTR, 32 MiB: throughput by platform, implementation and timing scope (decimal MB/s).</w:t>
       </w:r>
     </w:p>
     <w:tbl>
@@ -1355,7 +1569,7 @@
               <w:jc w:val="right"/>
             </w:pPr>
             <w:r>
-              <w:t>Operation</w:t>
+              <w:t>Full call</w:t>
             </w:r>
           </w:p>
         </w:tc>
@@ -1586,7 +1800,7 @@
               <w:jc w:val="right"/>
             </w:pPr>
             <w:r>
-              <w:t>1060</w:t>
+              <w:t>—</w:t>
             </w:r>
           </w:p>
         </w:tc>
@@ -1755,7 +1969,25 @@
         <w:rPr>
           <w:sz w:val="18"/>
         </w:rPr>
-        <w:t>Transform and operation values are different measured intervals. Oracle operation-envelope throughput is shown for the default EVP path only; unavailable or nonmatching aggregates are not filled in.</w:t>
+        <w:t>Transform and full-call rates use the intervals defined in Section</w:t>
+      </w:r>
+      <w:r>
+        <w:rPr>
+          <w:sz w:val="18"/>
+        </w:rPr>
+        <w:t xml:space="preserve"> </w:t>
+      </w:r>
+      <w:r>
+        <w:rPr>
+          <w:sz w:val="18"/>
+        </w:rPr>
+        <w:t>3</w:t>
+      </w:r>
+      <w:r>
+        <w:rPr>
+          <w:sz w:val="18"/>
+        </w:rPr>
+        <w:t>. Full call denotes the instrumented operation. Dashes indicate results outside the Arm64 transform dataset analyzed here.</w:t>
       </w:r>
     </w:p>
     <w:p>
@@ -1764,7 +1996,16 @@
         <w:spacing w:line="240" w:lineRule="auto"/>
       </w:pPr>
       <w:r>
-        <w:t>The size dependency is shown separately in Fig.</w:t>
+        <w:t>The Arm64 difference is large and repeatable within the recorded sessions. The default OpenSSL session medians range from 4018 to 4035 MB/s, while the masked configuration ranges from 217.4 to 218.4 MB/s and PyCryptodome from 208.8 to 209.5 MB/s. The approximately 19-fold throughput ratio between default OpenSSL and PyCryptodome therefore reflects a persistent difference between the evaluated paths. The reduction under capability masking also shows that OpenSSL's optimized capability selection is important on this host. Because the mask disables several features, the result cannot be attributed exclusively to AES instructions.</w:t>
+      </w:r>
+    </w:p>
+    <w:p>
+      <w:pPr>
+        <w:pStyle w:val="JText"/>
+        <w:spacing w:line="240" w:lineRule="auto"/>
+      </w:pPr>
+      <w:r>
+        <w:t>Figure</w:t>
       </w:r>
       <w:r>
         <w:t xml:space="preserve"> </w:t>
@@ -1773,7 +2014,7 @@
         <w:t>1</w:t>
       </w:r>
       <w:r>
-        <w:t>. On Windows, the small-message value at 1 KiB is dominated by a very short native interval; absolute rates at this scale are extremely sensitive to timer resolution, Python dispatch, and library overhead. Above 1 MiB the native EVP transform approaches a relatively stable multi-GB/s region, whereas the inspected PyCryptodome CTR path remains substantially slower. The Arm64 campaign shows a similarly strong separation of library paths across the tested sizes, but with its own software versions and hardware conditions. The two panels are intentionally not a matched platform speedup comparison.</w:t>
+        <w:t xml:space="preserve"> places the 32 MiB results in the context of message size. Larger payloads sustain substantially higher OpenSSL throughput than the alternative paths on each host. At 1 KiB, the native transform interval is very short, making the calculated rate more sensitive to timer resolution and call overhead. Large-buffer throughput should consequently not be used to predict the latency of short requests. The two panels describe separate software environments; differences between them are not estimates of an intrinsic x86-64 versus Arm64 performance ratio.</w:t>
       </w:r>
     </w:p>
     <w:p>
@@ -1832,7 +2073,19 @@
         <w:t xml:space="preserve">Fig. 1 – </w:t>
       </w:r>
       <w:r>
-        <w:t>Size dependence of the AES-128-CTR transform boundary on (a) Windows x86-64 and (b) Oracle Arm64; original session summaries analyzed separately. The panels illustrate software paths, not an architecture ranking.</w:t>
+        <w:t>AES-128-CTR transform throughput versus payload size on (a) Windows x86-64 and (b) Oracle Arm64. Each panel compares implementations within one host.</w:t>
+      </w:r>
+    </w:p>
+    <w:p>
+      <w:pPr>
+        <w:pStyle w:val="JSubSubTitle"/>
+      </w:pPr>
+      <w:r>
+        <w:t>4.2</w:t>
+        <w:tab/>
+      </w:r>
+      <w:r>
+        <w:t>Effect of the timed software operation</w:t>
       </w:r>
     </w:p>
     <w:p>
@@ -1841,37 +2094,7 @@
         <w:spacing w:line="240" w:lineRule="auto"/>
       </w:pPr>
       <w:r>
-        <w:t>The Windows transform ratio OpenSSL/PyCryptodome is about 1.9, but the operation-envelope improvement is closer to 1.2. These figures illustrate the sensitivity to timestamp placement. Crucially, some of this sensitivity is a wrapper-level effect: the Python-facing encryption path and native EVP inner interval do not make identical API calls. A system with a different caller, preallocated result buffers or cached contexts may obtain a different relationship.</w:t>
-      </w:r>
-    </w:p>
-    <w:p>
-      <w:pPr>
-        <w:pStyle w:val="JText"/>
-        <w:spacing w:line="240" w:lineRule="auto"/>
-      </w:pPr>
-      <w:r>
-        <w:t>On Arm64, the default EVP transform rate is approximately 19 times the PyCryptodome path at the same payload size under the observed implementations. The broad feature-mask control closely approaches the PyCryptodome rate. Since the mask removes multiple capabilities, no isolated AES-instruction attribution is possible; differences in context state, provider dispatch, memory copying and language bindings remain alternative or additional explanations.</w:t>
-      </w:r>
-    </w:p>
-    <w:p>
-      <w:pPr>
-        <w:pStyle w:val="JSubSubTitle"/>
-      </w:pPr>
-      <w:r>
-        <w:t>4.2</w:t>
-        <w:tab/>
-      </w:r>
-      <w:r>
-        <w:t>Cost of extending the measured boundary</w:t>
-      </w:r>
-    </w:p>
-    <w:p>
-      <w:pPr>
-        <w:pStyle w:val="JText"/>
-        <w:spacing w:line="240" w:lineRule="auto"/>
-      </w:pPr>
-      <w:r>
-        <w:t>Figure</w:t>
+        <w:t>Expanding the Windows timer from transformation to the instrumented operation changes the magnitude of the library difference (Fig.</w:t>
       </w:r>
       <w:r>
         <w:t xml:space="preserve"> </w:t>
@@ -1880,7 +2103,7 @@
         <w:t>2</w:t>
       </w:r>
       <w:r>
-        <w:t xml:space="preserve"> shows the gap between transform-only and broader operation-envelope throughput at 32 MiB on Windows. OpenSSL inner transformation exceeds 5.5 GB/s but the broader calling operation is below 1.5 GB/s. PyCryptodome shows a smaller absolute difference, while its wrapper-level transform remains slower than EVP. These are not contradictory measurements: they include different work. A benchmark that publishes only the inner OpenSSL rate can overstate the throughput a simple Python caller obtains when allocation, cipher setup and copying are repeated for each request.</w:t>
+        <w:t>). OpenSSL throughput decreases from 5537 to 1479 MB/s, while PyCryptodome decreases from 2877 to 1202 MB/s. The ratio of their aggregate rates consequently falls from approximately 1.93 to 1.23. Across sessions, the broader OpenSSL rate ranges from 1452 to 1625 MB/s and the PyCryptodome rate from 1179 to 1263 MB/s.</w:t>
       </w:r>
     </w:p>
     <w:p>
@@ -1939,7 +2162,7 @@
         <w:t xml:space="preserve">Fig. 2 – </w:t>
       </w:r>
       <w:r>
-        <w:t>Existing Windows measurements of AES-128-CTR at 32 MiB under two different execution boundaries. Both metrics are shown instead of selecting one favorable interval.</w:t>
+        <w:t>AES-128-CTR throughput at 32 MiB on Windows: transform processing and the instrumented operation. The broader interval includes preparation, result handling and benchmark diagnostics.</w:t>
       </w:r>
     </w:p>
     <w:p>
@@ -1948,7 +2171,16 @@
         <w:spacing w:line="240" w:lineRule="auto"/>
       </w:pPr>
       <w:r>
-        <w:t>The Oracle experiment provides a complementary diagnostic. Its broader default-OpenSSL operation rate at 32 MiB is approximately 1.06 GB/s, compared with 4.03 GB/s at the native inner interval. A separate two-worker run increased aggregate operation-envelope throughput to approximately 2.03 GB/s in the original campaign. The two-worker observation is a system-level scaling diagnostic on that instance; it cannot be treated as a controlled CPU-core efficiency estimate or as a speedup over a GPU.</w:t>
+        <w:t>The ordering remains the same, but the advantage is smaller when additional work is timed. Selecting the faster cipher path therefore does not produce an equally large improvement at every surrounding interface. Allocation, bindings, setup, result conversion and instrumentation contribute to the broader measurement, with different costs in each implementation. The measurements do not isolate their individual contributions, and subtracting aggregate medians would not provide a valid cost decomposition.</w:t>
+      </w:r>
+    </w:p>
+    <w:p>
+      <w:pPr>
+        <w:pStyle w:val="JText"/>
+        <w:spacing w:line="240" w:lineRule="auto"/>
+      </w:pPr>
+      <w:r>
+        <w:t>For application design, the relevant implication is to measure the interface actually used by the service. The instrumented operation demonstrates the sensitivity to measurement scope, but its diagnostic overhead prevents treating 1479 or 1202 MB/s as a prediction of production throughput. Buffer reuse, persistent contexts and different language bindings could change the relationship and require separate evaluation.</w:t>
       </w:r>
     </w:p>
     <w:p>
@@ -1960,7 +2192,7 @@
         <w:tab/>
       </w:r>
       <w:r>
-        <w:t>Key length and authenticated workload on windows</w:t>
+        <w:t>Key length and authenticated processing</w:t>
       </w:r>
     </w:p>
     <w:p>
@@ -1969,7 +2201,7 @@
         <w:spacing w:line="240" w:lineRule="auto"/>
       </w:pPr>
       <w:r>
-        <w:t xml:space="preserve">Historical local AES-CBC measurements show that acceleration affects each key length differently. </w:t>
+        <w:t>The separate CBC experiment shows how key length affects both absolute throughput and relative acceleration (</w:t>
       </w:r>
       <w:r>
         <w:rPr>
@@ -1990,7 +2222,7 @@
         <w:t>2</w:t>
       </w:r>
       <w:r>
-        <w:t xml:space="preserve"> reports AES-NI-enabled and software AES throughput for 10 MiB CBC encryption. The ranking is consistent with a higher round count for longer AES keys, but measured ratios also depend on library implementation and setup conventions.</w:t>
+        <w:t>). Software encryption decreases from 225.1 MB/s for AES-128 to 174.9 MB/s for AES-256; the AES-NI path decreases from 531.6 to 474.0 MB/s. Nevertheless, the session-based acceleration factor increases from 2.37 to 2.71. Thus, a larger relative benefit from acceleration can coexist with lower absolute throughput. The pattern is consistent with the additional rounds required by longer keys, although the measured factors remain specific to this implementation and mode.</w:t>
       </w:r>
     </w:p>
     <w:p>
@@ -2011,7 +2243,7 @@
         <w:rPr>
           <w:i/>
         </w:rPr>
-        <w:t>Historical 10 MiB CBC encryption on the Windows host (MB/s). These observations are not combined statistically with the later EVP campaign.</w:t>
+        <w:t>AES-CBC encryption at 10 MiB on Windows (MB/s). Speedups are medians of session-level time ratios.</w:t>
       </w:r>
     </w:p>
     <w:tbl>
@@ -2030,10 +2262,10 @@
         <w:tblLook w:val="01E0" w:firstRow="1" w:lastRow="1" w:firstColumn="1" w:lastColumn="1" w:noHBand="0" w:noVBand="0"/>
       </w:tblPr>
       <w:tblGrid>
-        <w:gridCol w:w="1701"/>
-        <w:gridCol w:w="1417"/>
-        <w:gridCol w:w="1843"/>
-        <w:gridCol w:w="2126"/>
+        <w:gridCol w:w="1809"/>
+        <w:gridCol w:w="1508"/>
+        <w:gridCol w:w="1960"/>
+        <w:gridCol w:w="1809"/>
       </w:tblGrid>
       <w:tr>
         <w:trPr>
@@ -2042,7 +2274,7 @@
         </w:trPr>
         <w:tc>
           <w:tcPr>
-            <w:tcW w:type="dxa" w:w="1701"/>
+            <w:tcW w:type="dxa" w:w="1809"/>
             <w:vAlign w:val="center"/>
           </w:tcPr>
           <w:p>
@@ -2060,7 +2292,7 @@
         </w:tc>
         <w:tc>
           <w:tcPr>
-            <w:tcW w:type="dxa" w:w="1417"/>
+            <w:tcW w:type="dxa" w:w="1508"/>
             <w:vAlign w:val="center"/>
           </w:tcPr>
           <w:p>
@@ -2078,7 +2310,7 @@
         </w:tc>
         <w:tc>
           <w:tcPr>
-            <w:tcW w:type="dxa" w:w="1843"/>
+            <w:tcW w:type="dxa" w:w="1960"/>
             <w:vAlign w:val="center"/>
           </w:tcPr>
           <w:p>
@@ -2096,7 +2328,7 @@
         </w:tc>
         <w:tc>
           <w:tcPr>
-            <w:tcW w:type="dxa" w:w="2126"/>
+            <w:tcW w:type="dxa" w:w="1809"/>
             <w:vAlign w:val="center"/>
           </w:tcPr>
           <w:p>
@@ -2108,7 +2340,7 @@
               <w:jc w:val="right"/>
             </w:pPr>
             <w:r>
-              <w:t>Reported gain</w:t>
+              <w:t>Speedup</w:t>
             </w:r>
           </w:p>
         </w:tc>
@@ -2119,7 +2351,7 @@
         </w:trPr>
         <w:tc>
           <w:tcPr>
-            <w:tcW w:type="dxa" w:w="1701"/>
+            <w:tcW w:type="dxa" w:w="1809"/>
             <w:vAlign w:val="center"/>
           </w:tcPr>
           <w:p>
@@ -2137,7 +2369,7 @@
         </w:tc>
         <w:tc>
           <w:tcPr>
-            <w:tcW w:type="dxa" w:w="1417"/>
+            <w:tcW w:type="dxa" w:w="1508"/>
             <w:vAlign w:val="center"/>
           </w:tcPr>
           <w:p>
@@ -2155,7 +2387,7 @@
         </w:tc>
         <w:tc>
           <w:tcPr>
-            <w:tcW w:type="dxa" w:w="1843"/>
+            <w:tcW w:type="dxa" w:w="1960"/>
             <w:vAlign w:val="center"/>
           </w:tcPr>
           <w:p>
@@ -2173,7 +2405,7 @@
         </w:tc>
         <w:tc>
           <w:tcPr>
-            <w:tcW w:type="dxa" w:w="2126"/>
+            <w:tcW w:type="dxa" w:w="1809"/>
             <w:vAlign w:val="center"/>
           </w:tcPr>
           <w:p>
@@ -2211,7 +2443,7 @@
         </w:trPr>
         <w:tc>
           <w:tcPr>
-            <w:tcW w:type="dxa" w:w="1701"/>
+            <w:tcW w:type="dxa" w:w="1809"/>
             <w:vAlign w:val="center"/>
           </w:tcPr>
           <w:p>
@@ -2229,7 +2461,7 @@
         </w:tc>
         <w:tc>
           <w:tcPr>
-            <w:tcW w:type="dxa" w:w="1417"/>
+            <w:tcW w:type="dxa" w:w="1508"/>
             <w:vAlign w:val="center"/>
           </w:tcPr>
           <w:p>
@@ -2247,7 +2479,7 @@
         </w:tc>
         <w:tc>
           <w:tcPr>
-            <w:tcW w:type="dxa" w:w="1843"/>
+            <w:tcW w:type="dxa" w:w="1960"/>
             <w:vAlign w:val="center"/>
           </w:tcPr>
           <w:p>
@@ -2265,7 +2497,7 @@
         </w:tc>
         <w:tc>
           <w:tcPr>
-            <w:tcW w:type="dxa" w:w="2126"/>
+            <w:tcW w:type="dxa" w:w="1809"/>
             <w:vAlign w:val="center"/>
           </w:tcPr>
           <w:p>
@@ -2303,7 +2535,7 @@
         </w:trPr>
         <w:tc>
           <w:tcPr>
-            <w:tcW w:type="dxa" w:w="1701"/>
+            <w:tcW w:type="dxa" w:w="1809"/>
             <w:vAlign w:val="center"/>
           </w:tcPr>
           <w:p>
@@ -2321,7 +2553,7 @@
         </w:tc>
         <w:tc>
           <w:tcPr>
-            <w:tcW w:type="dxa" w:w="1417"/>
+            <w:tcW w:type="dxa" w:w="1508"/>
             <w:vAlign w:val="center"/>
           </w:tcPr>
           <w:p>
@@ -2339,7 +2571,7 @@
         </w:tc>
         <w:tc>
           <w:tcPr>
-            <w:tcW w:type="dxa" w:w="1843"/>
+            <w:tcW w:type="dxa" w:w="1960"/>
             <w:vAlign w:val="center"/>
           </w:tcPr>
           <w:p>
@@ -2357,7 +2589,7 @@
         </w:tc>
         <w:tc>
           <w:tcPr>
-            <w:tcW w:type="dxa" w:w="2126"/>
+            <w:tcW w:type="dxa" w:w="1809"/>
             <w:vAlign w:val="center"/>
           </w:tcPr>
           <w:p>
@@ -2396,16 +2628,7 @@
         <w:spacing w:line="240" w:lineRule="auto"/>
       </w:pPr>
       <w:r>
-        <w:t>Although DES and triple DES were also measured in the historical investigation, their role is retrospective only. At 10 MiB, the corresponding software CBC encryption rates were approximately 87.4 and 32.6 MB/s; those values neither identify a modern deployment recommendation nor provide a matched cryptographic-security comparison. We do not expand that dataset into another algorithm-ranking table.</w:t>
-      </w:r>
-    </w:p>
-    <w:p>
-      <w:pPr>
-        <w:pStyle w:val="JText"/>
-        <w:spacing w:line="240" w:lineRule="auto"/>
-      </w:pPr>
-      <w:r>
-        <w:t xml:space="preserve">Authentication changes the workload. </w:t>
+        <w:t xml:space="preserve">Authenticated processing introduces a different workload. </w:t>
       </w:r>
       <w:r>
         <w:rPr>
@@ -2426,7 +2649,22 @@
         <w:t>3</w:t>
       </w:r>
       <w:r>
-        <w:t xml:space="preserve"> summarizes existing AES-GCM measurements, including tag verification during decryption, at three representative sizes. Small payloads pay a relatively large fixed cost: at 1 KiB, verified decryption is approximately 38 MB/s, whereas at 1 MiB the AES-128 variant exceeds 1.1 GB/s. This is a workload-size effect within one implementation family, not an empirically measured isolated GHASH instruction cost.</w:t>
+        <w:t xml:space="preserve"> reports representative GCM sizes, and Fig.</w:t>
+      </w:r>
+      <w:r>
+        <w:t xml:space="preserve"> </w:t>
+      </w:r>
+      <w:r>
+        <w:t>3</w:t>
+      </w:r>
+      <w:r>
+        <w:t xml:space="preserve"> includes all five evaluated sizes. At 1 KiB, AES-128 encryption reaches 70.6 MB/s, while verified decryption reaches 38.1 MB/s. At 1 MiB, the corresponding rates rise to 1148.2 and 1131.4 MB/s. The encryption</w:t>
+      </w:r>
+      <w:r>
+        <w:t>–</w:t>
+      </w:r>
+      <w:r>
+        <w:t>decryption difference is therefore much more pronounced for short messages than for large buffers.</w:t>
       </w:r>
     </w:p>
     <w:p>
@@ -2447,7 +2685,7 @@
         <w:rPr>
           <w:i/>
         </w:rPr>
-        <w:t>Existing authenticated AES-GCM throughput on Windows (decimal MB/s; encryption includes tag generation and decryption includes verification).</w:t>
+        <w:t>AES-GCM payload throughput on Windows (MB/s). Encryption includes tag generation; decryption includes verification. Cipher-object construction is excluded.</w:t>
       </w:r>
     </w:p>
     <w:tbl>
@@ -3012,24 +3250,6 @@
         </w:tc>
       </w:tr>
     </w:tbl>
-    <w:p>
-      <w:pPr>
-        <w:pStyle w:val="JText"/>
-        <w:spacing w:line="240" w:lineRule="auto"/>
-      </w:pPr>
-      <w:r>
-        <w:t>Figure</w:t>
-      </w:r>
-      <w:r>
-        <w:t xml:space="preserve"> </w:t>
-      </w:r>
-      <w:r>
-        <w:t>3</w:t>
-      </w:r>
-      <w:r>
-        <w:t xml:space="preserve"> uses a logarithmic payload axis to emphasize the transition from per-message overhead to sustained processing. At 16 KiB, authenticated decryption remains substantially slower than encryption, but at 1 MiB the gap is much smaller. This pattern is compatible with amortization of fixed work and mode-specific API behavior; the experiment did not independently time GHASH instructions or cryptographic setup at every size.</w:t>
-      </w:r>
-    </w:p>
     <w:p>
       <w:pPr>
         <w:pStyle w:val="JFigure"/>
@@ -3086,7 +3306,7 @@
         <w:t xml:space="preserve">Fig. 3 – </w:t>
       </w:r>
       <w:r>
-        <w:t>Existing Windows AES-GCM encryption and authenticated-decryption throughput for AES-128 and AES-256 over five payload sizes. Lines connect descriptive aggregate values, not a fitted scaling law.</w:t>
+        <w:t>AES-GCM encryption and verified-decryption throughput on Windows for five payload sizes. Lines connect the measured aggregate rates.</w:t>
       </w:r>
     </w:p>
     <w:p>
@@ -3095,7 +3315,16 @@
         <w:spacing w:line="240" w:lineRule="auto"/>
       </w:pPr>
       <w:r>
-        <w:t>The apparent plateau at larger payloads supports an interpretation in which fixed per-message work is amortized, but the measurements do not identify exact allocation, hashing or memory-bandwidth fractions. CBC and GCM values must remain separate: GCM returns an authenticated result, while CBC by itself does not.</w:t>
+        <w:t>This pattern is consistent with fixed processing costs being distributed over more payload bytes as message size increases. The plateau at larger sizes suggests that additional payload then increases processing time approximately in proportion to its length over the measured range. AES-256 generally achieves lower throughput than AES-128, as expected from its additional rounds. However, the experiment does not separately time authentication multiplication, verification or allocation, so it cannot assign the observed size dependence to one component.</w:t>
+      </w:r>
+    </w:p>
+    <w:p>
+      <w:pPr>
+        <w:pStyle w:val="JText"/>
+        <w:spacing w:line="240" w:lineRule="auto"/>
+      </w:pPr>
+      <w:r>
+        <w:t>These GCM results complement the CTR and CBC observations by showing why a benchmark must represent the required cryptographic service. GCM includes authentication, whereas the CTR and CBC workloads reported here measure confidentiality operations. Their throughput figures therefore describe different functionality. The GCM timer also excludes object construction, so a service handling independent messages must additionally account for setup and its surrounding request-processing costs.</w:t>
       </w:r>
     </w:p>
     <w:p>
@@ -3107,7 +3336,7 @@
         <w:tab/>
       </w:r>
       <w:r>
-        <w:t>Discussion</w:t>
+        <w:t>General Discussion</w:t>
       </w:r>
     </w:p>
     <w:p>
@@ -3119,7 +3348,7 @@
         <w:tab/>
       </w:r>
       <w:r>
-        <w:t>What the results establish</w:t>
+        <w:t>Implications for encryption performance</w:t>
       </w:r>
     </w:p>
     <w:p>
@@ -3128,28 +3357,7 @@
         <w:spacing w:line="240" w:lineRule="auto"/>
       </w:pPr>
       <w:r>
-        <w:t xml:space="preserve">The strongest result is </w:t>
-      </w:r>
-      <w:r>
-        <w:rPr>
-          <w:i/>
-        </w:rPr>
-        <w:t>implementation-path sensitivity under documented timing boundaries</w:t>
-      </w:r>
-      <w:r>
-        <w:t xml:space="preserve">. On Oracle Arm64, default EVP is much faster than the inspected alternative paths for AES-128-CTR at 32 MiB. On Windows, using an inner EVP timer makes OpenSSL appear considerably faster than PyCryptodome; expanding the observation to a broader software operation substantially narrows that advantage. Thus a claim such as </w:t>
-      </w:r>
-      <w:r>
-        <w:t>“</w:t>
-      </w:r>
-      <w:r>
-        <w:t>CPU AES achieves 5.5 GB/s</w:t>
-      </w:r>
-      <w:r>
-        <w:t>”</w:t>
-      </w:r>
-      <w:r>
-        <w:t xml:space="preserve"> is incomplete without declaring whether the caller is reusing contexts and buffers.</w:t>
+        <w:t>The results identify three aspects of AES performance that should be considered together: the selected implementation, the work included in the timer and the cryptographic service being provided. The Arm64 measurements show a large difference between library configurations. The Windows measurements show that the relative advantage narrows at a broader software interface. The CBC and GCM experiments show that key length, authentication and message size further shape the processing cost. A useful performance statement must therefore specify these conditions rather than attach a single rate to AES or to a processor architecture.</w:t>
       </w:r>
     </w:p>
     <w:p>
@@ -3158,7 +3366,7 @@
         <w:spacing w:line="240" w:lineRule="auto"/>
       </w:pPr>
       <w:r>
-        <w:t>A second observation concerns protected workloads rather than just AES round computations. At 1 KiB, authenticated GCM decryption plus verification can be much slower than at larger sizes when expressed as bytes per second. The AES key length also affects CBC and GCM performance. These data should not be collapsed into one architecture score; they address different cipher modes, key schedules and functional requirements.</w:t>
+        <w:t>This interpretation also clarifies the optimization question. When cipher processing dominates, a more efficient native implementation can offer substantial benefits. When other work occupies a larger part of the operation, optimizing that work becomes more important. The present data demonstrate the difference between measurement scopes, but do not determine the optimal balance for a particular application. That balance depends on its message distribution, buffer ownership, context lifetime and required security functionality.</w:t>
       </w:r>
     </w:p>
     <w:p>
@@ -3170,7 +3378,7 @@
         <w:tab/>
       </w:r>
       <w:r>
-        <w:t>Potential applications and transferability</w:t>
+        <w:t>Limitations and scope of generalization</w:t>
       </w:r>
     </w:p>
     <w:p>
@@ -3179,7 +3387,7 @@
         <w:spacing w:line="240" w:lineRule="auto"/>
       </w:pPr>
       <w:r>
-        <w:t>The most direct engineering application is benchmark and service design for CPU-based encryption components. A storage system, secure message processor or key-management service that repeatedly invokes a cryptographic API should benchmark the actual operation envelope, not only the cipher core. Systems handling large sequential buffers might benefit from native EVP processing and buffer reuse; systems dominated by small authenticated messages may see relatively greater importance of setup and tag verification. This is a plausible design implication, not a measured speedup of a particular storage product or network protocol.</w:t>
+        <w:t>The study contains repeated observations from one Windows laptop and one Arm64 cloud instance. Differences in processor configuration, operating system, OpenSSL version, scheduling and virtualization prevent a controlled architectural comparison. Processor affinity, dynamic frequency scaling and cloud contention were not fully controlled. Repeated use of prepared buffers also differs from a cold-cache or continuous streaming workload. Five sessions describe repeatability under these conditions, not variability across a population of machines.</w:t>
       </w:r>
     </w:p>
     <w:p>
@@ -3188,7 +3396,7 @@
         <w:spacing w:line="240" w:lineRule="auto"/>
       </w:pPr>
       <w:r>
-        <w:t>The generalizable element is the methodology, not the numerical ordering of processors. A useful performance report should identify the cipher and mode; key size and nonce/AAD policy; library version and capability dispatch; input residency and buffer policy; transform versus operation timing; and the distribution of session-level observations. The observations from an Arm64 virtual machine and a Windows laptop motivate such reporting across architectures, but do not themselves constitute a matched hardware shootout.</w:t>
+        <w:t>The measurement interfaces impose additional limits. PyCryptodome and OpenSSL transform timers include different language-interface costs, while the broader operation contains benchmark diagnostics. Capability inspection does not establish which instructions executed, and the Arm64 mask changes several capabilities simultaneously. The earlier CBC and GCM campaigns use their own timing conventions. These constraints permit comparisons within the stated scopes, but limit causal attribution and prevent combining all results into one acceleration factor.</w:t>
       </w:r>
     </w:p>
     <w:p>
@@ -3197,7 +3405,16 @@
         <w:spacing w:line="240" w:lineRule="auto"/>
       </w:pPr>
       <w:r>
-        <w:t>The presence of an additional historical Windows workstation does not remove this limitation. Since that machine lacks a directly comparable archived new EVP campaign, adding its CPU/GPU values to the present paper would manufacture comparability and overlap with a different submitted study. Likewise, comparing the Oracle CPU directly with a separately timed GPU would be misleading.</w:t>
+        <w:t>Functional validation establishes agreement with expected outputs and, for GCM, rejection of the tested modifications. It does not establish resistance to timing leakage or other implementation attacks. Similarly, the study does not evaluate key management, nonce generation in a deployed service, energy consumption or latency under concurrent client load. Performance conclusions apply to the measured operations and should be considered alongside those separate requirements.</w:t>
+      </w:r>
+    </w:p>
+    <w:p>
+      <w:pPr>
+        <w:pStyle w:val="JText"/>
+        <w:spacing w:line="240" w:lineRule="auto"/>
+      </w:pPr>
+      <w:r>
+        <w:t>The transferable finding is methodological: a comparison should preserve the workload and identify the timed interval relevant to its intended use. Numerical rankings remain specific to the tested configurations, even when the same evaluation method is applied elsewhere.</w:t>
       </w:r>
     </w:p>
     <w:p>
@@ -3209,7 +3426,7 @@
         <w:tab/>
       </w:r>
       <w:r>
-        <w:t>Threats to validity and future research</w:t>
+        <w:t>Applications and analogies in other domains</w:t>
       </w:r>
     </w:p>
     <w:p>
@@ -3218,7 +3435,7 @@
         <w:spacing w:line="240" w:lineRule="auto"/>
       </w:pPr>
       <w:r>
-        <w:t>This retrospective study is constrained by nonidentical APIs, differences in library versions, unpinned operating-system scheduling, DVFS and cloud virtualization. Default OpenSSL capability inspection is not a trace of executed instructions. The Arm capability mask disables multiple instruction classes at once, so a causal claim about any one extension is not warranted. The 32 MiB measurements reuse prepared data, and their cache and memory-allocation behavior may differ from a streaming application. The five seeds produce useful repetition within a platform, not a representative sample of processors. The AES-GCM and CBC campaigns use different timing conventions from the newer CTR experiments.</w:t>
+        <w:t>The findings are relevant to CPU-based storage encryption, secure messaging and data-processing services. A service handling large buffers can evaluate whether native processing and reusable output storage reduce its total cost. A service handling short authenticated messages should assess setup and verification together with payload processing. These are hypotheses for application evaluation; the experiments do not demonstrate a speedup in a complete storage system or communication protocol.</w:t>
       </w:r>
     </w:p>
     <w:p>
@@ -3227,7 +3444,7 @@
         <w:spacing w:line="240" w:lineRule="auto"/>
       </w:pPr>
       <w:r>
-        <w:t>There are several clearly bounded follow-up studies: (i) use identical native entry points and output-buffer reuse on both architectures; (ii) trace hardware instructions and isolate AES, vector and polynomial-multiply dispatch controls independently; (iii) measure GCM on Arm64 with matched nonce, associated-data and tag-validation policies; (iv) compare single-thread latency and two-worker aggregate throughput under a common process-orchestration protocol; and (v) validate encryption in a real application with request formation, input/output copying and persistent storage or network I/O. Those are future experiments, not results claimed here.</w:t>
+        <w:t>A similar distinction arises in compression, numerical computing and machine-learning inference. A fast compression routine may be surrounded by buffer allocation and data copying; an optimized numerical kernel may require data conversion; an inference engine may spend substantial time on preprocessing and request handling. These examples illustrate the same question of measurement scope. They are conceptual analogies rather than additional empirical findings of this study.</w:t>
       </w:r>
     </w:p>
     <w:p>
@@ -3236,7 +3453,37 @@
         <w:spacing w:line="240" w:lineRule="auto"/>
       </w:pPr>
       <w:r>
-        <w:t>The retained reduced-keyspace and avalanche demonstrations from the larger retrospective have been intentionally excluded. Their principal questions concern educational cryptanalysis and diffusion, rather than CPU encryption costs; including them would weaken the coherence of this implementation-boundary study.</w:t>
+        <w:t>A reproducible benchmark should report the mode, key size, payload distribution, nonce and AAD policy, library configuration, buffer policy and timer placement. Session-level variation should accompany aggregate rates. These details allow readers to assess whether a result represents the operation their application needs.</w:t>
+      </w:r>
+    </w:p>
+    <w:p>
+      <w:pPr>
+        <w:pStyle w:val="JSubSubTitle"/>
+      </w:pPr>
+      <w:r>
+        <w:t>5.4</w:t>
+        <w:tab/>
+      </w:r>
+      <w:r>
+        <w:t>Future research</w:t>
+      </w:r>
+    </w:p>
+    <w:p>
+      <w:pPr>
+        <w:pStyle w:val="JText"/>
+        <w:spacing w:line="240" w:lineRule="auto"/>
+      </w:pPr>
+      <w:r>
+        <w:t>A first priority is a matched native benchmark on both architectures, with identical entry points and explicit alternatives for context and output-buffer reuse. Instruction tracing and independently controlled capability settings would then help separate AES processing from vector and authentication-related optimizations. Such experiments would provide stronger explanations for the observed library differences.</w:t>
+      </w:r>
+    </w:p>
+    <w:p>
+      <w:pPr>
+        <w:pStyle w:val="JText"/>
+        <w:spacing w:line="240" w:lineRule="auto"/>
+      </w:pPr>
+      <w:r>
+        <w:t>A second priority is authenticated encryption on Arm64 under the same nonce, AAD and verification policy used on Windows. Measuring object construction, payload processing and complete request latency separately would connect the present GCM observations to application behavior. Finally, evaluation within a storage or messaging service should include realistic message distributions, concurrency and input/output costs. This would test whether the implementation advantages observed here remain useful when encryption is one stage of a larger workflow.</w:t>
       </w:r>
     </w:p>
     <w:p>
@@ -3257,13 +3504,22 @@
         <w:spacing w:line="240" w:lineRule="auto"/>
       </w:pPr>
       <w:r>
-        <w:t>Existing validated measurements from Windows x86-64 and Oracle Cloud Arm64 demonstrate that AES throughput is inseparable from the implementation path and the execution interval being timed. A native OpenSSL AES-128-CTR transform reached about 4.03 GB/s on the measured Arm64 system, whereas its inspected alternative paths were near 0.21</w:t>
+        <w:t>This study examined how AES implementation choices and measurement scope affect CPU encryption throughput. The analyzed records show a strong dependence on the selected library path: at 32 MiB, default OpenSSL achieves approximately 4.03 GB/s on the measured Arm64 system, compared with 0.21</w:t>
       </w:r>
       <w:r>
         <w:t>–</w:t>
       </w:r>
       <w:r>
-        <w:t>0.22 GB/s. On Windows, OpenSSL's 32 MiB inner transform achieved about 5.54 GB/s, but the wider operation envelope reduced reported throughput to about 1.48 GB/s. Additional CBC and GCM evidence illustrates key-length sensitivity and the cost profile of authenticated operations across message sizes. These observations do not rank processor architectures or isolate instruction-level causation. Their practical contribution is a reproducible way to interpret encryption benchmarks: every performance figure requires a specified cryptographic workload, implementation path, timing scope and replication unit.</w:t>
+        <w:t>0.22 GB/s for the evaluated alternatives. On Windows, the OpenSSL-to-PyCryptodome throughput ratio decreases from approximately 1.93 for transformation to 1.23 for the instrumented operation. Separate CBC and GCM experiments show that key length and authenticated message processing introduce further workload-dependent effects.</w:t>
+      </w:r>
+    </w:p>
+    <w:p>
+      <w:pPr>
+        <w:pStyle w:val="JText"/>
+        <w:spacing w:line="240" w:lineRule="auto"/>
+      </w:pPr>
+      <w:r>
+        <w:t>Cipher throughput must therefore be interpreted for the software interface and cryptographic functionality relevant to the application. Implementation selection and surrounding software costs should be evaluated together. Although the numerical results are specific to the measured systems, the analysis provides a clearer basis for comparing encryption benchmarks. Matched native measurements and evaluation within storage or messaging services are needed to establish application-level benefits.</w:t>
       </w:r>
     </w:p>
     <w:p>
@@ -3309,7 +3565,7 @@
         <w:jc w:val="left"/>
       </w:pPr>
       <w:r>
-        <w:t>Intel Corporation, “Intel Advanced Encryption Standard Instructions (AES-NI),” 2012. [Online]. Available: https://www.intel.com/content/www/us/en/developer/articles/technical/advanced-encryption-standard-instructions-aes-ni.html.</w:t>
+        <w:t>E. Käsper and P. Schwabe, “Faster and timing-attack resistant AES-GCM,” Cryptology ePrint Archive, Report 2009/129, 2009. [Online]. Available: https://eprint.iacr.org/2009/129.</w:t>
       </w:r>
     </w:p>
     <w:p>
@@ -3318,7 +3574,7 @@
         <w:jc w:val="left"/>
       </w:pPr>
       <w:r>
-        <w:t>OpenSSL Project, “EVP symmetric encryption and decryption,” OpenSSL documentation. [Online]. Available: https://docs.openssl.org/3.0/man3/EVP_EncryptInit/.</w:t>
+        <w:t>Intel Corporation, “Intel Advanced Encryption Standard Instructions (AES-NI),” 2012. [Online]. Available: https://www.intel.com/content/www/us/en/developer/articles/technical/advanced-encryption-standard-instructions-aes-ni.html.</w:t>
       </w:r>
     </w:p>
     <w:p>
@@ -3327,7 +3583,7 @@
         <w:jc w:val="left"/>
       </w:pPr>
       <w:r>
-        <w:t>PyCryptodome, “AES – Advanced Encryption Standard,” documentation. [Online]. Available: https://pycryptodome.readthedocs.io/en/latest/src/cipher/aes.html.</w:t>
+        <w:t>OpenSSL Project, “EVP symmetric encryption and decryption,” OpenSSL documentation. [Online]. Available: https://docs.openssl.org/3.0/man3/EVP_EncryptInit/.</w:t>
       </w:r>
     </w:p>
     <w:p>
@@ -3336,7 +3592,7 @@
         <w:jc w:val="left"/>
       </w:pPr>
       <w:r>
-        <w:t>National Bureau of Standards, DES Modes of Operation, FIPS PUB 81, 1980.</w:t>
+        <w:t>PyCryptodome, “AES – Advanced Encryption Standard,” documentation. [Online]. Available: https://pycryptodome.readthedocs.io/en/latest/src/cipher/aes.html.</w:t>
       </w:r>
     </w:p>
     <w:p>
@@ -3345,7 +3601,16 @@
         <w:jc w:val="left"/>
       </w:pPr>
       <w:r>
-        <w:t>E. Barker and A. Roginsky, Transitioning the Use of Cryptographic Algorithms and Key Lengths, NIST SP 800-131A Rev. 2, 2019, doi:10.6028/NIST.SP.800-131Ar2.</w:t>
+        <w:t>T. Mytkowicz, A. Diwan, M. Hauswirth and P. F. Sweeney, “Producing wrong data without doing anything obviously wrong!,” in Proceedings of ASPLOS, pp. 265–276, 2009, doi:10.1145/1508244.1508275.</w:t>
+      </w:r>
+    </w:p>
+    <w:p>
+      <w:pPr>
+        <w:pStyle w:val="JReference"/>
+        <w:jc w:val="left"/>
+      </w:pPr>
+      <w:r>
+        <w:t>T. Kalibera and R. E. Jones, “Rigorous benchmarking in reasonable time,” in Proceedings of the International Symposium on Memory Management, pp. 63–74, 2013, doi:10.1145/2464157.2464160.</w:t>
       </w:r>
     </w:p>
     <w:sectPr>

</xml_diff>

<commit_message>
Converted to SJEE’s bibliography workflow:
- Added references.bib (facta_cpu_aes/references.bib).
- PDF uses BibTeX with unsrtnat; DOCX reads the same database.
- Verified all 9 citations resolve and numbering matches in both formats.
</commit_message>
<xml_diff>
--- a/facta_cpu_aes/main_facta.docx
+++ b/facta_cpu_aes/main_facta.docx
@@ -3538,7 +3538,7 @@
         <w:jc w:val="left"/>
       </w:pPr>
       <w:r>
-        <w:t>National Institute of Standards and Technology, Advanced Encryption Standard (AES), FIPS 197, Update 1, 2023, doi:10.6028/NIST.FIPS.197-upd1.</w:t>
+        <w:t>National Institute of Standards and Technology: Advanced Encryption Standard (AES), National Institute of Standards and Technology, Federal Information Processing Standards Publication 197, Update 1, 2023, doi: 10.6028/NIST.FIPS.197-upd1.</w:t>
       </w:r>
     </w:p>
     <w:p>
@@ -3547,7 +3547,7 @@
         <w:jc w:val="left"/>
       </w:pPr>
       <w:r>
-        <w:t>M. Dworkin, Recommendation for Block Cipher Modes of Operation: Methods and Techniques, NIST SP 800-38A, 2001, doi:10.6028/NIST.SP.800-38A.</w:t>
+        <w:t>M. Dworkin: Recommendation for Block Cipher Modes of Operation: Methods and Techniques, National Institute of Standards and Technology, NIST Special Publication 800-38A, 2001, doi: 10.6028/NIST.SP.800-38A.</w:t>
       </w:r>
     </w:p>
     <w:p>
@@ -3556,7 +3556,7 @@
         <w:jc w:val="left"/>
       </w:pPr>
       <w:r>
-        <w:t>M. Dworkin, Recommendation for Block Cipher Modes of Operation: GCM and GMAC, NIST SP 800-38D, 2007, doi:10.6028/NIST.SP.800-38D.</w:t>
+        <w:t>M. Dworkin: Recommendation for Block Cipher Modes of Operation: Galois/Counter Mode (GCM) and GMAC, National Institute of Standards and Technology, NIST Special Publication 800-38D, 2007, doi: 10.6028/NIST.SP.800-38D.</w:t>
       </w:r>
     </w:p>
     <w:p>
@@ -3565,7 +3565,7 @@
         <w:jc w:val="left"/>
       </w:pPr>
       <w:r>
-        <w:t>E. Käsper and P. Schwabe, “Faster and timing-attack resistant AES-GCM,” Cryptology ePrint Archive, Report 2009/129, 2009. [Online]. Available: https://eprint.iacr.org/2009/129.</w:t>
+        <w:t>E. Käsper, P. Schwabe: Faster and Timing-Attack Resistant AES-GCM, International Association for Cryptologic Research, Cryptology ePrint Archive, Report 2009/129, 2009, https://eprint.iacr.org/2009/129.</w:t>
       </w:r>
     </w:p>
     <w:p>
@@ -3574,7 +3574,7 @@
         <w:jc w:val="left"/>
       </w:pPr>
       <w:r>
-        <w:t>Intel Corporation, “Intel Advanced Encryption Standard Instructions (AES-NI),” 2012. [Online]. Available: https://www.intel.com/content/www/us/en/developer/articles/technical/advanced-encryption-standard-instructions-aes-ni.html.</w:t>
+        <w:t>Intel Corporation: Intel Advanced Encryption Standard Instructions (AES-NI), 2012, https://www.intel.com/content/www/us/en/developer/articles/technical/advanced-encryption-standard-instructions-aes-ni.html.</w:t>
       </w:r>
     </w:p>
     <w:p>
@@ -3583,7 +3583,7 @@
         <w:jc w:val="left"/>
       </w:pPr>
       <w:r>
-        <w:t>OpenSSL Project, “EVP symmetric encryption and decryption,” OpenSSL documentation. [Online]. Available: https://docs.openssl.org/3.0/man3/EVP_EncryptInit/.</w:t>
+        <w:t>OpenSSL Project: EVP Symmetric Encryption and Decryption, OpenSSL documentation, n.d., https://docs.openssl.org/3.0/man3/EVP_EncryptInit/.</w:t>
       </w:r>
     </w:p>
     <w:p>
@@ -3592,7 +3592,7 @@
         <w:jc w:val="left"/>
       </w:pPr>
       <w:r>
-        <w:t>PyCryptodome, “AES – Advanced Encryption Standard,” documentation. [Online]. Available: https://pycryptodome.readthedocs.io/en/latest/src/cipher/aes.html.</w:t>
+        <w:t>PyCryptodome: AES – Advanced Encryption Standard, PyCryptodome documentation, n.d., https://pycryptodome.readthedocs.io/en/latest/src/cipher/aes.html.</w:t>
       </w:r>
     </w:p>
     <w:p>
@@ -3601,7 +3601,7 @@
         <w:jc w:val="left"/>
       </w:pPr>
       <w:r>
-        <w:t>T. Mytkowicz, A. Diwan, M. Hauswirth and P. F. Sweeney, “Producing wrong data without doing anything obviously wrong!,” in Proceedings of ASPLOS, pp. 265–276, 2009, doi:10.1145/1508244.1508275.</w:t>
+        <w:t>T. Mytkowicz, A. Diwan, M. Hauswirth, P. F. Sweeney: Producing Wrong Data Without Doing Anything Obviously Wrong!, Proceedings of the 14th International Conference on Architectural Support for Programming Languages and Operating Systems, 2009, pp. 265–276, doi: 10.1145/1508244.1508275.</w:t>
       </w:r>
     </w:p>
     <w:p>
@@ -3610,7 +3610,7 @@
         <w:jc w:val="left"/>
       </w:pPr>
       <w:r>
-        <w:t>T. Kalibera and R. E. Jones, “Rigorous benchmarking in reasonable time,” in Proceedings of the International Symposium on Memory Management, pp. 63–74, 2013, doi:10.1145/2464157.2464160.</w:t>
+        <w:t>T. Kalibera, R. E. Jones: Rigorous Benchmarking in Reasonable Time, Proceedings of the International Symposium on Memory Management, 2013, pp. 63–74, doi: 10.1145/2464157.2464160.</w:t>
       </w:r>
     </w:p>
     <w:sectPr>

</xml_diff>

<commit_message>
The paper now centers on performance-advantage attenuation, includes the redesigned Figure 2 and verified Oracle worker results, and strengthens practical implications and reproducibility. The i7 comparison remains excluded, with the reasoning documented.
</commit_message>
<xml_diff>
--- a/facta_cpu_aes/main_facta.docx
+++ b/facta_cpu_aes/main_facta.docx
@@ -39,13 +39,19 @@
         <w:t xml:space="preserve">Abstract: </w:t>
       </w:r>
       <w:r>
-        <w:t>Efficient AES encryption is important for secure storage and communication, yet processor support alone does not determine the throughput available to software. This paper examines how library implementation and measurement scope influence CPU encryption performance. We analyze previously collected, validated AES measurements from Windows x86-64 and Oracle Cloud Arm64, with separate CBC and GCM experiments addressing key length and authenticated processing. At 32 MiB, the default OpenSSL CTR implementation reaches 4.03 GB/s on Arm64, compared with 0.21</w:t>
-      </w:r>
-      <w:r>
-        <w:t>–</w:t>
-      </w:r>
-      <w:r>
-        <w:t>0.22 GB/s for the evaluated alternative implementations. On Windows, its throughput advantage over PyCryptodome decreases from approximately 1.9 to 1.2 when timing expands from encryption processing to the instrumented benchmark operation. These findings show why fast cipher execution does not directly predict performance at a broader software interface. They provide a basis for selecting representative benchmarks and identifying where further optimization may benefit encryption services.</w:t>
+        <w:t>AES throughput depends on implementation paths and on which software costs a benchmark includes. This paper quantifies how much of an optimized implementation's advantage persists when timing expands from encryption processing to a broader operation. We analyze validated CPU measurements from Windows x86-64 and Oracle Cloud Arm64, supported by separate AES-CBC and AES-GCM campaigns. At 32 MiB, default OpenSSL AES-CTR on Arm64 achieved approximately nineteen times the throughput of the evaluated alternative paths. On Windows, the OpenSSL-to-PyCryptodome throughput ratio decreased from approximately 1.93 at the transform boundary to 1.23 for the instrumented operation. The latter retained 26.7</w:t>
+      </w:r>
+      <w:r>
+        <w:t>%</w:t>
+      </w:r>
+      <w:r>
+        <w:t xml:space="preserve"> of OpenSSL's transform throughput and 41.8</w:t>
+      </w:r>
+      <w:r>
+        <w:t>%</w:t>
+      </w:r>
+      <w:r>
+        <w:t xml:space="preserve"> of PyCryptodome's. These findings show that cipher-level advantages need not transfer proportionally to surrounding software operations, motivating workload-specific library evaluation with explicit timing boundaries.</w:t>
       </w:r>
     </w:p>
     <w:p>
@@ -116,16 +122,16 @@
         <w:spacing w:line="240" w:lineRule="auto"/>
       </w:pPr>
       <w:r>
-        <w:t xml:space="preserve">This paper addresses the following research question: </w:t>
+        <w:t xml:space="preserve">The central research question is: </w:t>
       </w:r>
       <w:r>
         <w:rPr>
           <w:i/>
         </w:rPr>
-        <w:t>how do the selected AES implementation and the scope of the timed operation affect measured CPU throughput, and which conclusions remain useful for application design?</w:t>
-      </w:r>
-      <w:r>
-        <w:t xml:space="preserve"> We investigate this question through a retrospective analysis of validated measurements from a Windows x86-64 laptop and an Oracle Cloud Arm64 instance. AES-128 in counter (CTR) mode provides the main workload. Separate Windows experiments with cipher block chaining (CBC) and Galois/Counter Mode (GCM) extend the analysis to key length and authenticated processing</w:t>
+        <w:t>how much of an optimized AES implementation's throughput advantage survives when the measurement boundary expands from encryption processing to a broader software operation?</w:t>
+      </w:r>
+      <w:r>
+        <w:t xml:space="preserve"> We investigate this question through validated measurements from a Windows x86-64 laptop and an Oracle Cloud Arm64 instance. AES-128 in counter (CTR) mode provides the primary workload. Separate Windows experiments with cipher block chaining (CBC) and Galois/Counter Mode (GCM) provide supporting evidence on key length and authenticated message processing</w:t>
       </w:r>
       <w:r>
         <w:t xml:space="preserve"> </w:t>
@@ -143,7 +149,7 @@
         <w:spacing w:line="240" w:lineRule="auto"/>
       </w:pPr>
       <w:r>
-        <w:t>The paper makes three contributions. First, it quantifies the differences between the evaluated OpenSSL and PyCryptodome implementations on each host, including an OpenSSL capability-mask experiment on Arm64. Second, it shows how the relative performance observed on Windows changes when timing expands from encryption processing to the complete instrumented benchmark call. Third, it relates these observations to the effects of key length and message size in separate CBC and GCM workloads. Together, these contributions identify the information needed to interpret an encryption throughput figure and assess its relevance to a software service.</w:t>
+        <w:t>This study contributes an empirical characterization of the persistence of AES implementation advantages across software measurement boundaries. Two complementary findings support this contribution: the Arm64 results quantify sensitivity to library and capability selection, while the Windows results quantify the attenuation of OpenSSL's relative advantage when broader operation costs are included. CBC and GCM observations establish why this interpretation must also account for message size and cryptographic functionality. The contribution is an evidence-based account of the limits of translating cipher-level performance into software-operation performance, rather than a new AES implementation or a measurement of production application performance.</w:t>
       </w:r>
     </w:p>
     <w:p>
@@ -299,7 +305,7 @@
         <w:spacing w:line="240" w:lineRule="auto"/>
       </w:pPr>
       <w:r>
-        <w:t>Library interfaces add another layer. OpenSSL EVP exposes cipher operations through an abstraction whose selected implementation depends on the library configuration and available processor features</w:t>
+        <w:t>Library interfaces add another layer. OpenSSL EVP selects implementations according to library configuration and processor features</w:t>
       </w:r>
       <w:r>
         <w:t xml:space="preserve"> </w:t>
@@ -308,7 +314,7 @@
         <w:t>[6]</w:t>
       </w:r>
       <w:r>
-        <w:t>. PyCryptodome provides AES modes through a Python interface backed by native code</w:t>
+        <w:t>; PyCryptodome exposes native AES processing through Python</w:t>
       </w:r>
       <w:r>
         <w:t xml:space="preserve"> </w:t>
@@ -317,7 +323,7 @@
         <w:t>[7]</w:t>
       </w:r>
       <w:r>
-        <w:t>. Neither the common algorithm name nor the availability of processor instructions guarantees that two interfaces select equivalent code or include the same work in a timed call. The present comparison therefore concerns the particular library configurations and interfaces recorded in the experiments.</w:t>
+        <w:t>. Neither a common algorithm name nor available processor instructions guarantees equivalent code or timing scope. A comparison must therefore identify the actual library configuration and interface.</w:t>
       </w:r>
     </w:p>
     <w:p>
@@ -374,7 +380,7 @@
         <w:spacing w:line="240" w:lineRule="auto"/>
       </w:pPr>
       <w:r>
-        <w:t>The practical question addressed here is how strongly implementation and timing choices alter the interpretation of CPU encryption benchmarks. This study connects AES implementation research with benchmarking methodology through documented comparisons of library paths, timing scopes and cryptographic workloads. Its contribution is empirical clarification of these relationships on two systems, rather than a new AES implementation.</w:t>
+        <w:t>The practical gap addressed here is the persistence of a library advantage when more surrounding software work is timed. We connect implementation research with benchmarking methodology by quantifying both library-path contrasts and their attenuation across measurement boundaries. CBC and GCM provide supporting workload context rather than independent competing contributions.</w:t>
       </w:r>
     </w:p>
     <w:p>
@@ -407,7 +413,7 @@
         <w:spacing w:line="240" w:lineRule="auto"/>
       </w:pPr>
       <w:r>
-        <w:t>The primary dataset contains CPU library measurements from two environments. The Windows system used an Intel Core i5-10300H with four physical cores and eight logical processors, Python 3.12.10, PyCryptodome 3.23.0 and verified 64-bit OpenSSL 3.6.5 libraries. The Oracle Cloud system used a Neoverse-N1-class Arm64 processor with two available virtual CPUs, Python 3.12.3 and OpenSSL 3.0.13. The original records preserve platform metadata, processor capabilities and source hashes. The hosts differ in operating system, library version and hardware configuration, so each is analyzed separately.</w:t>
+        <w:t>The Windows system used an Intel Core i5-10300H (four cores, eight logical processors), Python 3.12.10, PyCryptodome 3.23.0 and verified 64-bit OpenSSL 3.6.5 libraries. The Oracle Cloud instance used a Neoverse-N1-class Arm64 processor with two available virtual CPUs, Python 3.12.3, PyCryptodome 3.23.0 and OpenSSL 3.0.13. Platform metadata, capability settings and source hashes are preserved in the experimental records.</w:t>
       </w:r>
     </w:p>
     <w:p>
@@ -416,13 +422,13 @@
         <w:spacing w:line="240" w:lineRule="auto"/>
       </w:pPr>
       <w:r>
-        <w:t>The primary campaigns evaluated AES-128 at payload sizes of 1 KiB, 16 KiB, 1 MiB, 16 MiB and 32 MiB. CTR is the principal workload presented here. Electronic codebook (ECB) measurements in the source records served as implementation diagnostics. Each configuration was measured in five sessions with seeds 2003</w:t>
+        <w:t>The primary campaigns evaluated AES-128 at 1 KiB, 16 KiB, 1 MiB, 16 MiB and 32 MiB. CTR provides the main workload; archived ECB measurements served as implementation diagnostics. Each configuration used five sessions with seeds 2003</w:t>
       </w:r>
       <w:r>
         <w:t>–</w:t>
       </w:r>
       <w:r>
-        <w:t>2007, using five warm-up repetitions and 20 measured repetitions per session. Known-answer and differential checks established ciphertext correctness before performance results were accepted. Raw observations, metadata and session summaries were retained.</w:t>
+        <w:t>2007, five warm-up repetitions and 20 measured repetitions per session. Known-answer and differential checks established ciphertext correctness before samples were accepted.</w:t>
       </w:r>
     </w:p>
     <w:p>
@@ -431,7 +437,19 @@
         <w:spacing w:line="240" w:lineRule="auto"/>
       </w:pPr>
       <w:r>
-        <w:t>Two earlier Windows campaigns provide complementary evidence. The CBC experiment compared software and AES-NI-enabled implementations for 128-, 192- and 256-bit keys; the present paper reports its 10 MiB encryption results. The GCM experiment evaluated 128- and 256-bit keys at 1 KiB, 16 KiB, 1 MiB, 16 MiB and 100 MiB. Both used five seeded sessions, three warm-up repetitions and 20 measured repetitions. These datasets retain their original timing definitions and are analyzed separately from the CTR campaign.</w:t>
+        <w:t>Separate earlier Windows campaigns evaluated CBC with 128-, 192- and 256-bit keys and GCM with 128- and 256-bit keys. Both used five seeded sessions, three warm-up repetitions and 20 measured repetitions. We retain the CBC results at 10 MiB and GCM results at 1 KiB, 16 KiB, 1 MiB, 16 MiB and 100 MiB. GCM used 96-bit nonces, 128-bit tags and 16 bytes of AAD, without nonce reuse for distinct messages under one key within a session. Validation included known-answer checks and rejection of modified ciphertext, tags and AAD.</w:t>
+      </w:r>
+    </w:p>
+    <w:p>
+      <w:pPr>
+        <w:pStyle w:val="JSubSubTitle"/>
+      </w:pPr>
+      <w:r>
+        <w:t>3.2</w:t>
+        <w:tab/>
+      </w:r>
+      <w:r>
+        <w:t>Implementation paths and timing scopes</w:t>
       </w:r>
     </w:p>
     <w:p>
@@ -440,19 +458,7 @@
         <w:spacing w:line="240" w:lineRule="auto"/>
       </w:pPr>
       <w:r>
-        <w:t>The GCM workload used a 96-bit nonce, a 128-bit authentication tag and 16 bytes of associated authenticated data (AAD), with no nonce reuse for distinct messages under the same key within a session. Validation included known-answer checks and rejection of modified ciphertext, tags and AAD. These checks establish functional correctness for the tested cases; they do not constitute a side-channel security evaluation.</w:t>
-      </w:r>
-    </w:p>
-    <w:p>
-      <w:pPr>
-        <w:pStyle w:val="JSubSubTitle"/>
-      </w:pPr>
-      <w:r>
-        <w:t>3.2</w:t>
-        <w:tab/>
-      </w:r>
-      <w:r>
-        <w:t>Implementation paths and timing scopes</w:t>
+        <w:t>Both CTR transform measurements use prepared output buffers. OpenSSL timestamps inside a compiled wrapper delimit EVP Update/Final processing; PyCryptodome's transform interval includes Python dispatch and its internal foreign-function interface. The resulting rates describe different interfaces, rather than isolated AES instruction costs.</w:t>
       </w:r>
     </w:p>
     <w:p>
@@ -461,16 +467,7 @@
         <w:spacing w:line="240" w:lineRule="auto"/>
       </w:pPr>
       <w:r>
-        <w:t>The CTR comparison uses PyCryptodome and native OpenSSL EVP. Both transform measurements use prepared output buffers. For OpenSSL, timestamps inside the compiled wrapper delimit the EVP Update/Final processing. For PyCryptodome, the transform interval includes Python dispatch and the library's internal foreign-function interface. Thus, the recorded transform rates describe each implementation at its measured interface; their ratio does not isolate the relative cost of AES instructions.</w:t>
-      </w:r>
-    </w:p>
-    <w:p>
-      <w:pPr>
-        <w:pStyle w:val="JText"/>
-        <w:spacing w:line="240" w:lineRule="auto"/>
-      </w:pPr>
-      <w:r>
-        <w:t xml:space="preserve">A second interval, termed the </w:t>
+        <w:t xml:space="preserve">The </w:t>
       </w:r>
       <w:r>
         <w:rPr>
@@ -479,7 +476,7 @@
         <w:t>instrumented operation</w:t>
       </w:r>
       <w:r>
-        <w:t xml:space="preserve">, measures the Python call to the benchmark's measurement routine. It includes input checks, allocation, buffer bindings, setup, transformation, cleanup and output conversion, together with diagnostic calls and timing bookkeeping where applicable. This is the interval named </w:t>
+        <w:t xml:space="preserve">, named </w:t>
       </w:r>
       <w:r>
         <w:rPr>
@@ -500,7 +497,7 @@
         <w:t>envelope</w:t>
       </w:r>
       <w:r>
-        <w:t xml:space="preserve"> in the records. It provides a broader view of the same benchmark execution, but is not an uninstrumented application request or a complete storage or network operation. The Windows dataset provides both intervals for the library comparison.</w:t>
+        <w:t xml:space="preserve"> in the records, measures the Python call to the benchmark routine and assignment of its result. It includes input checks, allocation, bindings, setup, transformation, cleanup, output conversion and applicable diagnostics and bookkeeping. The subsequent ciphertext comparison is outside the timer. This boundary is broader than transformation, but is not an uninstrumented application request. Windows provides both intervals for each library.</w:t>
       </w:r>
     </w:p>
     <w:p>
@@ -509,7 +506,7 @@
         <w:spacing w:line="240" w:lineRule="auto"/>
       </w:pPr>
       <w:r>
-        <w:t xml:space="preserve">On Arm64, OpenSSL was also evaluated with </w:t>
+        <w:t xml:space="preserve">On Arm64, </w:t>
       </w:r>
       <w:r>
         <w:rPr>
@@ -530,7 +527,7 @@
         <w:t>armcap=0</w:t>
       </w:r>
       <w:r>
-        <w:t>. This setting disables multiple optimized capability paths. Comparing it with the default configuration tests sensitivity to capability selection within OpenSSL, but cannot isolate the effect of the AES extension from other disabled features. The analysis uses the archived Arm64 transform summaries and does not infer unrecorded instruction execution from capability flags.</w:t>
+        <w:t xml:space="preserve"> disables multiple optimized capability paths. Default and masked OpenSSL are compared at their common native transform boundary, while the PyCryptodome interval includes additional interface costs. No instruction trace was collected.</w:t>
       </w:r>
     </w:p>
     <w:p>
@@ -539,7 +536,7 @@
         <w:spacing w:line="240" w:lineRule="auto"/>
       </w:pPr>
       <w:r>
-        <w:t>The CBC results compare the software and AES-NI paths under the original campaign's common timing convention. GCM encryption includes AAD processing, payload encryption, output allocation and tag generation; decryption includes authentication-tag verification. Construction of a fresh GCM cipher object is excluded. Throughput counts payload bytes only, even though AAD and tag processing contribute to elapsed time. These rates therefore describe authenticated payload processing after object construction, rather than complete message latency.</w:t>
+        <w:t>CBC retains its original common timing convention for software and AES-NI paths. GCM includes AAD processing, payload processing, output allocation and tag generation or verification, but excludes construction of a fresh cipher object. Its throughput numerator counts payload bytes only. The three campaigns therefore retain distinct operational definitions.</w:t>
       </w:r>
     </w:p>
     <w:p>
@@ -771,7 +768,7 @@
         <w:spacing w:line="240" w:lineRule="auto"/>
       </w:pPr>
       <w:r>
-        <w:t>KiB and MiB denote binary payload sizes; MB/s and GB/s denote decimal rates. Each primary result is the median of five session-level throughput medians. Session ranges, where reported, describe the smallest and largest of those five medians rather than confidence intervals.</w:t>
+        <w:t>KiB and MiB denote binary payload sizes; MB/s and GB/s denote decimal rates. Each primary result is the median of five session-level rates, calculated as payload bytes divided by the median elapsed time in that session. Session ranges, where reported, describe the smallest and largest of those five medians rather than confidence intervals.</w:t>
       </w:r>
     </w:p>
     <w:p>
@@ -1400,7 +1397,118 @@
         <w:spacing w:line="240" w:lineRule="auto"/>
       </w:pPr>
       <w:r>
-        <w:t>The session is the unit of replication. Repetitions are not pooled to imply additional independent experiments, and observations are not excluded because they show unfavorable performance. Five sessions characterize repeatability on the measured host, but do not establish population-level behavior across processors. Comparisons across hosts or cipher modes are descriptive and are not treated as paired trials.</w:t>
+        <w:t>To characterize attenuation, we calculate the OpenSSL/PyCryptodome throughput ratio separately at each boundary. We also calculate, for each library, its instrumented-operation throughput divided by its transform throughput. These retention ratios use unrounded campaign aggregates and describe changes across timing scopes. They are not estimates of the fractions of time spent on allocation, setup or conversion; causal decomposition would require additional component-level measurements.</w:t>
+      </w:r>
+    </w:p>
+    <w:p>
+      <w:pPr>
+        <w:pStyle w:val="JText"/>
+        <w:spacing w:line="240" w:lineRule="auto"/>
+      </w:pPr>
+      <w:r>
+        <w:t>Sessions, rather than individual repetitions, are the units of replication. Observations are retained regardless of performance direction. Comparisons across hosts, modes and the separate Oracle worker campaigns are descriptive, not statistically paired.</w:t>
+      </w:r>
+    </w:p>
+    <w:p>
+      <w:pPr>
+        <w:pStyle w:val="JSubSubTitle"/>
+      </w:pPr>
+      <w:r>
+        <w:t>3.4</w:t>
+        <w:tab/>
+      </w:r>
+      <w:r>
+        <w:t>Archive verification and reproducibility</w:t>
+      </w:r>
+    </w:p>
+    <w:p>
+      <w:pPr>
+        <w:pStyle w:val="JText"/>
+        <w:spacing w:line="240" w:lineRule="auto"/>
+      </w:pPr>
+      <w:r>
+        <w:t>Reanalysis reads archived data without executing benchmark code. It verifies the selected campaign, five distinct seeds, sample counts, validation status and source hashes. Duplicate single-worker sessions inside the Oracle multicore archive are excluded. Windows contrasts are calculated from unrounded session-summary aggregates.</w:t>
+      </w:r>
+    </w:p>
+    <w:p>
+      <w:pPr>
+        <w:pStyle w:val="JText"/>
+        <w:spacing w:line="240" w:lineRule="auto"/>
+      </w:pPr>
+      <w:r>
+        <w:t>For Oracle, raw timestamps reconstruct the instrumented-operation boundary in both campaigns. Each worker processes 32 MiB with AES-128-CTR and default OpenSSL. Per repetition, duration is the latest completion minus the earliest start; the numerator is 32 MiB for one worker and 64 MiB for two. Each session rate is this byte count divided by its median duration, followed by the median of five session rates. Native transform rates are neither summed nor compared with these operation rates.</w:t>
+      </w:r>
+    </w:p>
+    <w:p>
+      <w:pPr>
+        <w:pStyle w:val="JText"/>
+        <w:spacing w:line="240" w:lineRule="auto"/>
+      </w:pPr>
+      <w:r>
+        <w:t xml:space="preserve">The accompanying </w:t>
+      </w:r>
+      <w:r>
+        <w:rPr>
+          <w:rFonts w:ascii="Courier New" w:hAnsi="Courier New"/>
+        </w:rPr>
+        <w:t>analyze</w:t>
+      </w:r>
+      <w:r>
+        <w:rPr>
+          <w:rFonts w:ascii="Courier New" w:hAnsi="Courier New"/>
+        </w:rPr>
+        <w:t>_</w:t>
+      </w:r>
+      <w:r>
+        <w:rPr>
+          <w:rFonts w:ascii="Courier New" w:hAnsi="Courier New"/>
+        </w:rPr>
+        <w:t>evidence.py</w:t>
+      </w:r>
+      <w:r>
+        <w:t xml:space="preserve"> records archive/member hashes, session identifiers, durations and derived ratios in a machine-readable audit. The </w:t>
+      </w:r>
+      <w:r>
+        <w:rPr>
+          <w:rFonts w:ascii="Courier New" w:hAnsi="Courier New"/>
+        </w:rPr>
+        <w:t>plot</w:t>
+      </w:r>
+      <w:r>
+        <w:rPr>
+          <w:rFonts w:ascii="Courier New" w:hAnsi="Courier New"/>
+        </w:rPr>
+        <w:t>_</w:t>
+      </w:r>
+      <w:r>
+        <w:rPr>
+          <w:rFonts w:ascii="Courier New" w:hAnsi="Courier New"/>
+        </w:rPr>
+        <w:t>windows</w:t>
+      </w:r>
+      <w:r>
+        <w:rPr>
+          <w:rFonts w:ascii="Courier New" w:hAnsi="Courier New"/>
+        </w:rPr>
+        <w:t>_</w:t>
+      </w:r>
+      <w:r>
+        <w:rPr>
+          <w:rFonts w:ascii="Courier New" w:hAnsi="Courier New"/>
+        </w:rPr>
+        <w:t>boundaries.py</w:t>
+      </w:r>
+      <w:r>
+        <w:t xml:space="preserve"> script checks the Windows input hash and regenerates Fig.</w:t>
+      </w:r>
+      <w:r>
+        <w:t xml:space="preserve"> </w:t>
+      </w:r>
+      <w:r>
+        <w:t>2</w:t>
+      </w:r>
+      <w:r>
+        <w:t>. These scripts reproduce the numerical contrasts from the preserved records without new measurements.</w:t>
       </w:r>
     </w:p>
     <w:p>
@@ -1424,7 +1532,7 @@
         <w:tab/>
       </w:r>
       <w:r>
-        <w:t>Effect of the library implementation</w:t>
+        <w:t>Implementation-path sensitivity</w:t>
       </w:r>
     </w:p>
     <w:p>
@@ -1987,7 +2095,7 @@
         <w:rPr>
           <w:sz w:val="18"/>
         </w:rPr>
-        <w:t>. Full call denotes the instrumented operation. Dashes indicate results outside the Arm64 transform dataset analyzed here.</w:t>
+        <w:t>. Full call denotes the instrumented operation. Dashes separate the Arm64 transform comparison from the operation-level worker analysis below.</w:t>
       </w:r>
     </w:p>
     <w:p>
@@ -1996,7 +2104,130 @@
         <w:spacing w:line="240" w:lineRule="auto"/>
       </w:pPr>
       <w:r>
-        <w:t>The Arm64 difference is large and repeatable within the recorded sessions. The default OpenSSL session medians range from 4018 to 4035 MB/s, while the masked configuration ranges from 217.4 to 218.4 MB/s and PyCryptodome from 208.8 to 209.5 MB/s. The approximately 19-fold throughput ratio between default OpenSSL and PyCryptodome therefore reflects a persistent difference between the evaluated paths. The reduction under capability masking also shows that OpenSSL's optimized capability selection is important on this host. Because the mask disables several features, the result cannot be attributed exclusively to AES instructions.</w:t>
+        <w:t xml:space="preserve">On Arm64, the default OpenSSL/PyCryptodome throughput ratio is approximately </w:t>
+      </w:r>
+      <m:oMath>
+        <m:box>
+          <m:e>
+            <m:r>
+              <m:rPr>
+                <m:sty m:val="p"/>
+              </m:rPr>
+              <w:rPr>
+                <w:sz w:val="22"/>
+              </w:rPr>
+              <m:t>19.3</m:t>
+            </m:r>
+            <m:r>
+              <m:rPr>
+                <m:sty m:val="p"/>
+              </m:rPr>
+              <w:rPr>
+                <w:sz w:val="22"/>
+              </w:rPr>
+              <m:t>×</m:t>
+            </m:r>
+          </m:e>
+        </m:box>
+      </m:oMath>
+      <w:r>
+        <w:t xml:space="preserve">, while the default/masked OpenSSL ratio is </w:t>
+      </w:r>
+      <m:oMath>
+        <m:box>
+          <m:e>
+            <m:r>
+              <m:rPr>
+                <m:sty m:val="p"/>
+              </m:rPr>
+              <w:rPr>
+                <w:sz w:val="22"/>
+              </w:rPr>
+              <m:t>18.5</m:t>
+            </m:r>
+            <m:r>
+              <m:rPr>
+                <m:sty m:val="p"/>
+              </m:rPr>
+              <w:rPr>
+                <w:sz w:val="22"/>
+              </w:rPr>
+              <m:t>×</m:t>
+            </m:r>
+          </m:e>
+        </m:box>
+      </m:oMath>
+      <w:r>
+        <w:t xml:space="preserve">. On Windows, the transform-scope OpenSSL/PyCryptodome contrast is approximately </w:t>
+      </w:r>
+      <m:oMath>
+        <m:box>
+          <m:e>
+            <m:r>
+              <m:rPr>
+                <m:sty m:val="p"/>
+              </m:rPr>
+              <w:rPr>
+                <w:sz w:val="22"/>
+              </w:rPr>
+              <m:t>1.93</m:t>
+            </m:r>
+            <m:r>
+              <m:rPr>
+                <m:sty m:val="p"/>
+              </m:rPr>
+              <w:rPr>
+                <w:sz w:val="22"/>
+              </w:rPr>
+              <m:t>×</m:t>
+            </m:r>
+          </m:e>
+        </m:box>
+      </m:oMath>
+      <w:r>
+        <w:t xml:space="preserve">. These are implementation/interface throughput contrasts, not isolated AES instruction speedups. In particular, </w:t>
+      </w:r>
+      <w:r>
+        <w:rPr>
+          <w:rFonts w:ascii="Courier New" w:hAnsi="Courier New"/>
+        </w:rPr>
+        <w:t>OPENSSL</w:t>
+      </w:r>
+      <w:r>
+        <w:rPr>
+          <w:rFonts w:ascii="Courier New" w:hAnsi="Courier New"/>
+        </w:rPr>
+        <w:t>_</w:t>
+      </w:r>
+      <w:r>
+        <w:rPr>
+          <w:rFonts w:ascii="Courier New" w:hAnsi="Courier New"/>
+        </w:rPr>
+        <w:t>armcap=0</w:t>
+      </w:r>
+      <w:r>
+        <w:t xml:space="preserve"> changes multiple hardware-optimized execution capabilities rather than selectively disabling AES instructions.</w:t>
+      </w:r>
+    </w:p>
+    <w:p>
+      <w:pPr>
+        <w:pStyle w:val="JText"/>
+        <w:spacing w:line="240" w:lineRule="auto"/>
+      </w:pPr>
+      <w:r>
+        <w:t>The Arm64 difference is consistent across the five recorded sessions. Default OpenSSL session medians range from 4018 to 4035 MB/s, compared with 217.4</w:t>
+      </w:r>
+      <w:r>
+        <w:t>–</w:t>
+      </w:r>
+      <w:r>
+        <w:t>218.4 MB/s for masked OpenSSL and 208.8</w:t>
+      </w:r>
+      <w:r>
+        <w:t>–</w:t>
+      </w:r>
+      <w:r>
+        <w:t>209.5 MB/s for PyCryptodome. Thus, the approximately nineteen-fold separation is substantially larger than the observed session variation. It demonstrates sensitivity to implementation and capability configuration on this cloud instance, but does not isolate one instruction or establish an architectural advantage of Arm64 over x86-64.</w:t>
       </w:r>
     </w:p>
     <w:p>
@@ -2085,7 +2316,7 @@
         <w:tab/>
       </w:r>
       <w:r>
-        <w:t>Effect of the timed software operation</w:t>
+        <w:t>Attenuation of implementation advantages</w:t>
       </w:r>
     </w:p>
     <w:p>
@@ -2094,16 +2325,61 @@
         <w:spacing w:line="240" w:lineRule="auto"/>
       </w:pPr>
       <w:r>
-        <w:t>Expanding the Windows timer from transformation to the instrumented operation changes the magnitude of the library difference (Fig.</w:t>
-      </w:r>
-      <w:r>
-        <w:t xml:space="preserve"> </w:t>
-      </w:r>
-      <w:r>
-        <w:t>2</w:t>
-      </w:r>
-      <w:r>
-        <w:t>). OpenSSL throughput decreases from 5537 to 1479 MB/s, while PyCryptodome decreases from 2877 to 1202 MB/s. The ratio of their aggregate rates consequently falls from approximately 1.93 to 1.23. Across sessions, the broader OpenSSL rate ranges from 1452 to 1625 MB/s and the PyCryptodome rate from 1179 to 1263 MB/s.</w:t>
+        <w:t xml:space="preserve">The Windows measurements provide the central comparison across timing boundaries. At 32 MiB, OpenSSL achieves 5537 MB/s for the transform and 1479 MB/s for the instrumented operation; PyCryptodome achieves 2877 and 1202 MB/s, respectively. The OpenSSL/PyCryptodome ratio decreases from approximately </w:t>
+      </w:r>
+      <m:oMath>
+        <m:box>
+          <m:e>
+            <m:r>
+              <m:rPr>
+                <m:sty m:val="p"/>
+              </m:rPr>
+              <w:rPr>
+                <w:sz w:val="22"/>
+              </w:rPr>
+              <m:t>1.93</m:t>
+            </m:r>
+            <m:r>
+              <m:rPr>
+                <m:sty m:val="p"/>
+              </m:rPr>
+              <w:rPr>
+                <w:sz w:val="22"/>
+              </w:rPr>
+              <m:t>×</m:t>
+            </m:r>
+          </m:e>
+        </m:box>
+      </m:oMath>
+      <w:r>
+        <w:t xml:space="preserve"> to </w:t>
+      </w:r>
+      <m:oMath>
+        <m:box>
+          <m:e>
+            <m:r>
+              <m:rPr>
+                <m:sty m:val="p"/>
+              </m:rPr>
+              <w:rPr>
+                <w:sz w:val="22"/>
+              </w:rPr>
+              <m:t>1.23</m:t>
+            </m:r>
+            <m:r>
+              <m:rPr>
+                <m:sty m:val="p"/>
+              </m:rPr>
+              <w:rPr>
+                <w:sz w:val="22"/>
+              </w:rPr>
+              <m:t>×</m:t>
+            </m:r>
+          </m:e>
+        </m:box>
+      </m:oMath>
+      <w:r>
+        <w:t xml:space="preserve"> (unrounded ratios 1.9247 and 1.2299). The broader OpenSSL session medians range from 1452 to 1625 MB/s, while the PyCryptodome medians range from 1179 to 1263 MB/s.</w:t>
       </w:r>
     </w:p>
     <w:p>
@@ -2115,7 +2391,7 @@
       <w:r>
         <w:drawing>
           <wp:inline xmlns:a="http://schemas.openxmlformats.org/drawingml/2006/main" xmlns:pic="http://schemas.openxmlformats.org/drawingml/2006/picture">
-            <wp:extent cx="4500000" cy="2122500"/>
+            <wp:extent cx="4500000" cy="2250000"/>
             <wp:docPr id="2" name="Picture 2"/>
             <wp:cNvGraphicFramePr>
               <a:graphicFrameLocks noChangeAspect="1"/>
@@ -2142,7 +2418,7 @@
                   <pic:spPr>
                     <a:xfrm>
                       <a:off x="0" y="0"/>
-                      <a:ext cx="4500000" cy="2122500"/>
+                      <a:ext cx="4500000" cy="2250000"/>
                     </a:xfrm>
                     <a:prstGeom prst="rect"/>
                   </pic:spPr>
@@ -2162,7 +2438,7 @@
         <w:t xml:space="preserve">Fig. 2 – </w:t>
       </w:r>
       <w:r>
-        <w:t>AES-128-CTR throughput at 32 MiB on Windows: transform processing and the instrumented operation. The broader interval includes preparation, result handling and benchmark diagnostics.</w:t>
+        <w:t>Attenuation of the OpenSSL advantage for Windows AES-128-CTR at 32 MiB. (a) Throughput at each measured boundary. (b) OpenSSL/PyCryptodome ratios calculated from unrounded campaign aggregates. Retention is operation throughput divided by transform throughput, not a component-level overhead measurement.</w:t>
       </w:r>
     </w:p>
     <w:p>
@@ -2171,7 +2447,40 @@
         <w:spacing w:line="240" w:lineRule="auto"/>
       </w:pPr>
       <w:r>
-        <w:t>The ordering remains the same, but the advantage is smaller when additional work is timed. Selecting the faster cipher path therefore does not produce an equally large improvement at every surrounding interface. Allocation, bindings, setup, result conversion and instrumentation contribute to the broader measurement, with different costs in each implementation. The measurements do not isolate their individual contributions, and subtracting aggregate medians would not provide a valid cost decomposition.</w:t>
+        <w:t>Expressed as a proportion of transform throughput, the broader operation retains 26.7</w:t>
+      </w:r>
+      <w:r>
+        <w:t>%</w:t>
+      </w:r>
+      <w:r>
+        <w:t xml:space="preserve"> for OpenSSL and 41.8</w:t>
+      </w:r>
+      <w:r>
+        <w:t>%</w:t>
+      </w:r>
+      <w:r>
+        <w:t xml:space="preserve"> for PyCryptodome. Figure</w:t>
+      </w:r>
+      <w:r>
+        <w:t xml:space="preserve"> </w:t>
+      </w:r>
+      <w:r>
+        <w:t>2</w:t>
+      </w:r>
+      <w:r>
+        <w:t xml:space="preserve"> distinguishes this within-library retention from the between-library throughput ratio. The former describes how much throughput remains when the timed scope expands; the latter shows how much relative advantage remains over the alternative implementation. OpenSSL remains faster in this benchmark, but its approximately 93</w:t>
+      </w:r>
+      <w:r>
+        <w:t>%</w:t>
+      </w:r>
+      <w:r>
+        <w:t xml:space="preserve"> transform-level advantage becomes approximately 23</w:t>
+      </w:r>
+      <w:r>
+        <w:t>%</w:t>
+      </w:r>
+      <w:r>
+        <w:t xml:space="preserve"> at the broader boundary.</w:t>
       </w:r>
     </w:p>
     <w:p>
@@ -2180,7 +2489,61 @@
         <w:spacing w:line="240" w:lineRule="auto"/>
       </w:pPr>
       <w:r>
-        <w:t>For application design, the relevant implication is to measure the interface actually used by the service. The instrumented operation demonstrates the sensitivity to measurement scope, but its diagnostic overhead prevents treating 1479 or 1202 MB/s as a prediction of production throughput. Buffer reuse, persistent contexts and different language bindings could change the relationship and require separate evaluation.</w:t>
+        <w:t>These observations quantify attenuation without identifying its component causes. The native OpenSSL transform excludes the outer Python entry, whereas the PyCryptodome transform includes Python dispatch and its internal foreign-function interface. The broader operation adds preparation, allocation, bindings, setup, result conversion and diagnostics, with implementation-specific costs. The retention ratios cannot establish how much each component contributes, and subtracting aggregate medians would not provide a valid decomposition. In particular, they do not show that allocation alone accounts for the difference or that the library ranking would reverse at another interface.</w:t>
+      </w:r>
+    </w:p>
+    <w:p>
+      <w:pPr>
+        <w:pStyle w:val="JText"/>
+        <w:spacing w:line="240" w:lineRule="auto"/>
+      </w:pPr>
+      <w:r>
+        <w:t>The practical result is that an implementation advantage measured for prepared encryption processing need not transfer proportionally to a surrounding software operation. The instrumented operation is broader than the transform, but it remains a benchmark call rather than production end-to-end latency. Context reuse, buffer reuse and alternative bindings are consequently candidates for controlled follow-up experiments, not improvements already demonstrated by these measurements.</w:t>
+      </w:r>
+    </w:p>
+    <w:p>
+      <w:pPr>
+        <w:pStyle w:val="JText"/>
+        <w:spacing w:line="240" w:lineRule="auto"/>
+      </w:pPr>
+      <w:r>
+        <w:t xml:space="preserve">As a secondary operation-level observation, the verified Oracle archives yield 1059.6 MB/s for one worker and 2031.1 MB/s in aggregate for two workers, a descriptive ratio of approximately </w:t>
+      </w:r>
+      <m:oMath>
+        <m:box>
+          <m:e>
+            <m:r>
+              <m:rPr>
+                <m:sty m:val="p"/>
+              </m:rPr>
+              <w:rPr>
+                <w:sz w:val="22"/>
+              </w:rPr>
+              <m:t>1.92</m:t>
+            </m:r>
+            <m:r>
+              <m:rPr>
+                <m:sty m:val="p"/>
+              </m:rPr>
+              <w:rPr>
+                <w:sz w:val="22"/>
+              </w:rPr>
+              <m:t>×</m:t>
+            </m:r>
+          </m:e>
+        </m:box>
+      </m:oMath>
+      <w:r>
+        <w:t>. Each worker processes 32 MiB, so the two-worker measurement covers 64 MiB across the common completion interval. This is increased aggregate throughput, not a reduction in the latency of one 32 MiB operation. The campaigns comprise separate sessions and are not statistically paired; the ratio is therefore not a controlled causal estimate of multicore scaling efficiency. Both rates use the instrumented-operation boundary defined in Section</w:t>
+      </w:r>
+      <w:r>
+        <w:t xml:space="preserve"> </w:t>
+      </w:r>
+      <w:r>
+        <w:t>3</w:t>
+      </w:r>
+      <w:r>
+        <w:t>.</w:t>
       </w:r>
     </w:p>
     <w:p>
@@ -2201,7 +2564,7 @@
         <w:spacing w:line="240" w:lineRule="auto"/>
       </w:pPr>
       <w:r>
-        <w:t>The separate CBC experiment shows how key length affects both absolute throughput and relative acceleration (</w:t>
+        <w:t>As supporting workload evidence, the separate CBC experiment shows how key length affects both absolute throughput and relative acceleration (</w:t>
       </w:r>
       <w:r>
         <w:rPr>
@@ -2658,13 +3021,7 @@
         <w:t>3</w:t>
       </w:r>
       <w:r>
-        <w:t xml:space="preserve"> includes all five evaluated sizes. At 1 KiB, AES-128 encryption reaches 70.6 MB/s, while verified decryption reaches 38.1 MB/s. At 1 MiB, the corresponding rates rise to 1148.2 and 1131.4 MB/s. The encryption</w:t>
-      </w:r>
-      <w:r>
-        <w:t>–</w:t>
-      </w:r>
-      <w:r>
-        <w:t>decryption difference is therefore much more pronounced for short messages than for large buffers.</w:t>
+        <w:t xml:space="preserve"> includes all five evaluated sizes. At 1 KiB, AES-128 encryption reaches 70.6 MB/s, while verified decryption reaches 38.1 MB/s. At 1 MiB, the corresponding rates rise to 1148.2 and 1131.4 MB/s. At 100 MiB, the corresponding rates are 1179.7 and 1189.3 MB/s. Encryption generates a tag, whereas authenticated decryption verifies it; their API paths therefore have distinct processing requirements, particularly visible for short payloads.</w:t>
       </w:r>
     </w:p>
     <w:p>
@@ -3324,7 +3681,7 @@
         <w:spacing w:line="240" w:lineRule="auto"/>
       </w:pPr>
       <w:r>
-        <w:t>These GCM results complement the CTR and CBC observations by showing why a benchmark must represent the required cryptographic service. GCM includes authentication, whereas the CTR and CBC workloads reported here measure confidentiality operations. Their throughput figures therefore describe different functionality. The GCM timer also excludes object construction, so a service handling independent messages must additionally account for setup and its surrounding request-processing costs.</w:t>
+        <w:t>These GCM results complement the CTR and CBC observations by showing why a benchmark must represent the required cryptographic service. GCM includes authentication, whereas the CTR and CBC workloads reported here measure confidentiality operations. Their throughput figures therefore describe different functionality. These observations originate from separate campaigns with their own timing conventions; they do not measure an incremental GCM-versus-CTR authentication penalty or isolate authentication overhead. The GCM timer also excludes object construction, so a service handling independent messages must additionally account for setup and its surrounding request-processing costs.</w:t>
       </w:r>
     </w:p>
     <w:p>
@@ -3348,7 +3705,7 @@
         <w:tab/>
       </w:r>
       <w:r>
-        <w:t>Implications for encryption performance</w:t>
+        <w:t>Practical implications for CPU encryption systems</w:t>
       </w:r>
     </w:p>
     <w:p>
@@ -3357,7 +3714,7 @@
         <w:spacing w:line="240" w:lineRule="auto"/>
       </w:pPr>
       <w:r>
-        <w:t>The results identify three aspects of AES performance that should be considered together: the selected implementation, the work included in the timer and the cryptographic service being provided. The Arm64 measurements show a large difference between library configurations. The Windows measurements show that the relative advantage narrows at a broader software interface. The CBC and GCM experiments show that key length, authentication and message size further shape the processing cost. A useful performance statement must therefore specify these conditions rather than attach a single rate to AES or to a processor architecture.</w:t>
+        <w:t>The measurements indicate that cryptographic-library selection and operation design should be considered jointly. OpenSSL's substantial transform advantage on Windows becomes smaller when the timer includes the surrounding instrumented operation. The fastest isolated cipher implementation therefore need not deliver a proportionally faster complete request, and a different request design could change the ranking. The observed ranking applies to this benchmark, not a production service.</w:t>
       </w:r>
     </w:p>
     <w:p>
@@ -3366,7 +3723,34 @@
         <w:spacing w:line="240" w:lineRule="auto"/>
       </w:pPr>
       <w:r>
-        <w:t>This interpretation also clarifies the optimization question. When cipher processing dominates, a more efficient native implementation can offer substantial benefits. When other work occupies a larger part of the operation, optimizing that work becomes more important. The present data demonstrate the difference between measurement scopes, but do not determine the optimal balance for a particular application. That balance depends on its message distribution, buffer ownership, context lifetime and required security functionality.</w:t>
+        <w:t>Selecting an optimized native library matters most when encryption processing occupies a substantial part of the relevant operation. For bulk workloads, the Arm64 contrast makes capability selection an important configuration check. At broader interfaces, allocation, context initialization, conversion and result handling also deserve attention. Engineers should measure their actual interface and payload distribution, then test whether persistent contexts, reusable output buffers or fewer conversions reduce its cost. These remain testable opportunities, not demonstrated improvements.</w:t>
+      </w:r>
+    </w:p>
+    <w:p>
+      <w:pPr>
+        <w:pStyle w:val="JText"/>
+        <w:spacing w:line="240" w:lineRule="auto"/>
+      </w:pPr>
+      <w:r>
+        <w:t>Short authenticated messages require separate evaluation. The GCM encryption and verified-decryption rates at 1 KiB differ markedly from those at 1 MiB and above, even though cipher-object construction is excluded throughout. Large-buffer throughput consequently cannot characterize complete short-message requests. An application-level evaluation should include the required setup, AAD and tag operations, as well as the surrounding request processing.</w:t>
+      </w:r>
+    </w:p>
+    <w:p>
+      <w:pPr>
+        <w:pStyle w:val="JText"/>
+        <w:spacing w:line="240" w:lineRule="auto"/>
+      </w:pPr>
+      <w:r>
+        <w:t>Cloud users should distinguish advertised instruction availability from library configuration and actual execution. A practical audit records the loaded cryptographic library, version, provider and capability overrides, then checks capability settings in that same runtime. OpenSSL exposes CPU settings through its diagnostic interface</w:t>
+      </w:r>
+      <w:r>
+        <w:t xml:space="preserve"> </w:t>
+      </w:r>
+      <w:r>
+        <w:t>[10]</w:t>
+      </w:r>
+      <w:r>
+        <w:t>; a separate command-line installation should not be assumed to represent the library loaded by an application. Correctness checks and interface-specific measurements can reveal slow configurations; instruction tracing is needed to establish the executed path.</w:t>
       </w:r>
     </w:p>
     <w:p>
@@ -3387,7 +3771,7 @@
         <w:spacing w:line="240" w:lineRule="auto"/>
       </w:pPr>
       <w:r>
-        <w:t>The study contains repeated observations from one Windows laptop and one Arm64 cloud instance. Differences in processor configuration, operating system, OpenSSL version, scheduling and virtualization prevent a controlled architectural comparison. Processor affinity, dynamic frequency scaling and cloud contention were not fully controlled. Repeated use of prepared buffers also differs from a cold-cache or continuous streaming workload. Five sessions describe repeatability under these conditions, not variability across a population of machines.</w:t>
+        <w:t>Different processors, operating systems, libraries and runtimes prevent a controlled x86-versus-Arm comparison. Five sessions per configuration are repeated observations on one system, not five independent systems. Scheduling, frequency and cloud contention were not fully controlled, and prepared-buffer reuse differs from cold-cache or streaming workloads. The Oracle worker campaigns are nonpaired and have different aggregate byte counts.</w:t>
       </w:r>
     </w:p>
     <w:p>
@@ -3396,7 +3780,28 @@
         <w:spacing w:line="240" w:lineRule="auto"/>
       </w:pPr>
       <w:r>
-        <w:t>The measurement interfaces impose additional limits. PyCryptodome and OpenSSL transform timers include different language-interface costs, while the broader operation contains benchmark diagnostics. Capability inspection does not establish which instructions executed, and the Arm64 mask changes several capabilities simultaneously. The earlier CBC and GCM campaigns use their own timing conventions. These constraints permit comparisons within the stated scopes, but limit causal attribution and prevent combining all results into one acceleration factor.</w:t>
+        <w:t xml:space="preserve">The timing scopes also constrain interpretation. OpenSSL's native transform and PyCryptodome's Python-level transform include different interface costs. The broader operation includes benchmark diagnostics and bookkeeping, so neither throughput retention nor the change in library ratio measures a production request or identifies an individual overhead component. </w:t>
+      </w:r>
+      <w:r>
+        <w:rPr>
+          <w:rFonts w:ascii="Courier New" w:hAnsi="Courier New"/>
+        </w:rPr>
+        <w:t>OPENSSL</w:t>
+      </w:r>
+      <w:r>
+        <w:rPr>
+          <w:rFonts w:ascii="Courier New" w:hAnsi="Courier New"/>
+        </w:rPr>
+        <w:t>_</w:t>
+      </w:r>
+      <w:r>
+        <w:rPr>
+          <w:rFonts w:ascii="Courier New" w:hAnsi="Courier New"/>
+        </w:rPr>
+        <w:t>armcap=0</w:t>
+      </w:r>
+      <w:r>
+        <w:t xml:space="preserve"> changes several capabilities at once, and no instruction-level execution trace was collected. The observed effects of implementation and timing scope are empirical findings; explanations in terms of particular instructions, allocation costs or conversion costs remain hypotheses requiring controlled profiling.</w:t>
       </w:r>
     </w:p>
     <w:p>
@@ -3405,7 +3810,7 @@
         <w:spacing w:line="240" w:lineRule="auto"/>
       </w:pPr>
       <w:r>
-        <w:t>Functional validation establishes agreement with expected outputs and, for GCM, rejection of the tested modifications. It does not establish resistance to timing leakage or other implementation attacks. Similarly, the study does not evaluate key management, nonce generation in a deployed service, energy consumption or latency under concurrent client load. Performance conclusions apply to the measured operations and should be considered alongside those separate requirements.</w:t>
+        <w:t>CBC, GCM and CTR originate from separate campaigns with different timing conventions, preventing a matched estimate of authentication cost. Functional validation covers the tested outputs and GCM rejection cases, not side-channel resistance. No complete storage or messaging application, deployed key-management workflow or energy profile was measured.</w:t>
       </w:r>
     </w:p>
     <w:p>
@@ -3414,7 +3819,7 @@
         <w:spacing w:line="240" w:lineRule="auto"/>
       </w:pPr>
       <w:r>
-        <w:t>The transferable finding is methodological: a comparison should preserve the workload and identify the timed interval relevant to its intended use. Numerical rankings remain specific to the tested configurations, even when the same evaluation method is applied elsewhere.</w:t>
+        <w:t>The strongest generalization concerns experimental design: evaluate the required functionality at the relevant interface and distinguish processing from surrounding-operation costs. Numerical ratios remain specific to the recorded configurations.</w:t>
       </w:r>
     </w:p>
     <w:p>
@@ -3435,7 +3840,7 @@
         <w:spacing w:line="240" w:lineRule="auto"/>
       </w:pPr>
       <w:r>
-        <w:t>The findings are relevant to CPU-based storage encryption, secure messaging and data-processing services. A service handling large buffers can evaluate whether native processing and reusable output storage reduce its total cost. A service handling short authenticated messages should assess setup and verification together with payload processing. These are hypotheses for application evaluation; the experiments do not demonstrate a speedup in a complete storage system or communication protocol.</w:t>
+        <w:t>Bulk storage and messaging services should test implementation advantages after preparation and result delivery, using their actual payload distributions. The Oracle observation also motivates measuring aggregate completion under concurrency separately from single-request latency.</w:t>
       </w:r>
     </w:p>
     <w:p>
@@ -3444,7 +3849,7 @@
         <w:spacing w:line="240" w:lineRule="auto"/>
       </w:pPr>
       <w:r>
-        <w:t>A similar distinction arises in compression, numerical computing and machine-learning inference. A fast compression routine may be surrounded by buffer allocation and data copying; an optimized numerical kernel may require data conversion; an inference engine may spend substantial time on preprocessing and request handling. These examples illustrate the same question of measurement scope. They are conceptual analogies rather than additional empirical findings of this study.</w:t>
+        <w:t>The same measurement issue arises in compression, numerical computing and machine-learning inference. Buffer preparation can surround a fast compression routine, data conversion can precede an optimized numerical kernel, and preprocessing can accompany inference. These are conceptual analogies: a component-level advantage must be evaluated within the larger operation that uses it. No measurements from those domains are claimed here.</w:t>
       </w:r>
     </w:p>
     <w:p>
@@ -3453,7 +3858,7 @@
         <w:spacing w:line="240" w:lineRule="auto"/>
       </w:pPr>
       <w:r>
-        <w:t>A reproducible benchmark should report the mode, key size, payload distribution, nonce and AAD policy, library configuration, buffer policy and timer placement. Session-level variation should accompany aggregate rates. These details allow readers to assess whether a result represents the operation their application needs.</w:t>
+        <w:t>For reproducibility, a report should specify the cipher mode, key size, payload distribution, nonce and AAD policy, loaded library and capability configuration, buffer ownership and exact timer placement. It should distinguish per-worker from aggregate throughput, identify the byte count used at each boundary, and preserve session-level observations rather than only the best rate. These details make it possible to reproduce a contrast and assess its relevance to another workload.</w:t>
       </w:r>
     </w:p>
     <w:p>
@@ -3474,7 +3879,7 @@
         <w:spacing w:line="240" w:lineRule="auto"/>
       </w:pPr>
       <w:r>
-        <w:t>A first priority is a matched native benchmark on both architectures, with identical entry points and explicit alternatives for context and output-buffer reuse. Instruction tracing and independently controlled capability settings would then help separate AES processing from vector and authentication-related optimizations. Such experiments would provide stronger explanations for the observed library differences.</w:t>
+        <w:t>The first priority is a comparison with matched native entry boundaries for OpenSSL and PyCryptodome, with controlled alternatives for context and output-buffer reuse. This would separate implementation differences from language-interface and preparation costs. Instruction-level profiling on Arm64, combined with selective validation of cryptographic capability settings where supported, would provide stronger evidence about the optimized paths responsible for the observed contrast.</w:t>
       </w:r>
     </w:p>
     <w:p>
@@ -3483,7 +3888,7 @@
         <w:spacing w:line="240" w:lineRule="auto"/>
       </w:pPr>
       <w:r>
-        <w:t>A second priority is authenticated encryption on Arm64 under the same nonce, AAD and verification policy used on Windows. Measuring object construction, payload processing and complete request latency separately would connect the present GCM observations to application behavior. Finally, evaluation within a storage or messaging service should include realistic message distributions, concurrency and input/output costs. This would test whether the implementation advantages observed here remain useful when encryption is one stage of a larger workflow.</w:t>
+        <w:t>A second priority is equivalent AES-GCM encryption and verified-decryption workloads on Arm64, preserving nonce, AAD and tag policies and measuring setup separately. Complete request-level benchmarks should then use realistic message-size distributions, concurrency and input/output costs to test whether the observed advantages survive within a service. If suitable instrumentation becomes available, energy per processed byte and per completed request would provide an additional criterion alongside throughput and latency. These studies remain future work.</w:t>
       </w:r>
     </w:p>
     <w:p>
@@ -3504,13 +3909,73 @@
         <w:spacing w:line="240" w:lineRule="auto"/>
       </w:pPr>
       <w:r>
-        <w:t>This study examined how AES implementation choices and measurement scope affect CPU encryption throughput. The analyzed records show a strong dependence on the selected library path: at 32 MiB, default OpenSSL achieves approximately 4.03 GB/s on the measured Arm64 system, compared with 0.21</w:t>
-      </w:r>
-      <w:r>
-        <w:t>–</w:t>
-      </w:r>
-      <w:r>
-        <w:t>0.22 GB/s for the evaluated alternatives. On Windows, the OpenSSL-to-PyCryptodome throughput ratio decreases from approximately 1.93 for transformation to 1.23 for the instrumented operation. Separate CBC and GCM experiments show that key length and authenticated message processing introduce further workload-dependent effects.</w:t>
+        <w:t xml:space="preserve">This study quantified how much of an AES implementation advantage survives a broader measurement boundary. The Oracle Arm64 results establish strong sensitivity to implementation and capability selection, with default OpenSSL reaching approximately nineteen times the transform throughput of the evaluated alternatives. The central Windows comparison shows that OpenSSL's relative advantage decreases from approximately </w:t>
+      </w:r>
+      <m:oMath>
+        <m:box>
+          <m:e>
+            <m:r>
+              <m:rPr>
+                <m:sty m:val="p"/>
+              </m:rPr>
+              <w:rPr>
+                <w:sz w:val="22"/>
+              </w:rPr>
+              <m:t>1.93</m:t>
+            </m:r>
+            <m:r>
+              <m:rPr>
+                <m:sty m:val="p"/>
+              </m:rPr>
+              <w:rPr>
+                <w:sz w:val="22"/>
+              </w:rPr>
+              <m:t>×</m:t>
+            </m:r>
+          </m:e>
+        </m:box>
+      </m:oMath>
+      <w:r>
+        <w:t xml:space="preserve"> for transformation to </w:t>
+      </w:r>
+      <m:oMath>
+        <m:box>
+          <m:e>
+            <m:r>
+              <m:rPr>
+                <m:sty m:val="p"/>
+              </m:rPr>
+              <w:rPr>
+                <w:sz w:val="22"/>
+              </w:rPr>
+              <m:t>1.23</m:t>
+            </m:r>
+            <m:r>
+              <m:rPr>
+                <m:sty m:val="p"/>
+              </m:rPr>
+              <w:rPr>
+                <w:sz w:val="22"/>
+              </w:rPr>
+              <m:t>×</m:t>
+            </m:r>
+          </m:e>
+        </m:box>
+      </m:oMath>
+      <w:r>
+        <w:t xml:space="preserve"> for the instrumented operation. Broader-operation throughput retains 26.7</w:t>
+      </w:r>
+      <w:r>
+        <w:t>%</w:t>
+      </w:r>
+      <w:r>
+        <w:t xml:space="preserve"> of the OpenSSL transform rate and 41.8</w:t>
+      </w:r>
+      <w:r>
+        <w:t>%</w:t>
+      </w:r>
+      <w:r>
+        <w:t xml:space="preserve"> of the PyCryptodome rate, without identifying the costs of individual overhead components.</w:t>
       </w:r>
     </w:p>
     <w:p>
@@ -3519,7 +3984,7 @@
         <w:spacing w:line="240" w:lineRule="auto"/>
       </w:pPr>
       <w:r>
-        <w:t>Cipher throughput must therefore be interpreted for the software interface and cryptographic functionality relevant to the application. Implementation selection and surrounding software costs should be evaluated together. Although the numerical results are specific to the measured systems, the analysis provides a clearer basis for comparing encryption benchmarks. Matched native measurements and evaluation within storage or messaging services are needed to establish application-level benefits.</w:t>
+        <w:t>The contribution is a reproducible characterization of the limits of translating cipher-processing performance into software-operation performance. Supporting CBC and GCM observations reinforce the need to preserve message size and cryptographic functionality when interpreting throughput. Implementation selection should therefore be evaluated together with the operation that invokes it. Matched interfaces, instruction-level profiling and complete request benchmarks are needed to establish causes and application benefits beyond these measured configurations.</w:t>
       </w:r>
     </w:p>
     <w:p>
@@ -3611,6 +4076,15 @@
       </w:pPr>
       <w:r>
         <w:t>T. Kalibera, R. E. Jones: Rigorous Benchmarking in Reasonable Time, Proceedings of the International Symposium on Memory Management, 2013, pp. 63–74, doi: 10.1145/2464157.2464160.</w:t>
+      </w:r>
+    </w:p>
+    <w:p>
+      <w:pPr>
+        <w:pStyle w:val="JReference"/>
+        <w:jc w:val="left"/>
+      </w:pPr>
+      <w:r>
+        <w:t>OpenSSL Project: openssl-info: Print OpenSSL Built-in Information, OpenSSL 3.0 documentation, n.d., https://docs.openssl.org/3.0/man1/openssl-info/.</w:t>
       </w:r>
     </w:p>
     <w:sectPr>

</xml_diff>